<commit_message>
final-idea-finalize folder is the final 30 keypoints results
</commit_message>
<xml_diff>
--- a/insights.docx
+++ b/insights.docx
@@ -20,7 +20,7 @@
     <w:p>
       <w:r>
         <w:pict w14:anchorId="5DA5184F">
-          <v:rect id="_x0000_i1043" style="width:0;height:0" o:hralign="center" o:hrstd="t" o:hr="t" fillcolor="#a0a0a0" stroked="f"/>
+          <v:rect id="_x0000_i1025" style="width:0;height:0" o:hralign="center" o:hrstd="t" o:hr="t" fillcolor="#a0a0a0" stroked="f"/>
         </w:pict>
       </w:r>
     </w:p>
@@ -29,14 +29,24 @@
         <w:rPr>
           <w:b/>
           <w:bCs/>
-        </w:rPr>
-      </w:pPr>
-      <w:r>
-        <w:rPr>
-          <w:b/>
-          <w:bCs/>
+          <w:color w:val="EE0000"/>
+        </w:rPr>
+      </w:pPr>
+      <w:r>
+        <w:rPr>
+          <w:b/>
+          <w:bCs/>
+          <w:color w:val="EE0000"/>
         </w:rPr>
         <w:t>V1 vs V2 — Side-by-Side Analysis</w:t>
+      </w:r>
+      <w:r>
+        <w:rPr>
+          <w:b/>
+          <w:bCs/>
+          <w:color w:val="EE0000"/>
+        </w:rPr>
+        <w:t>(best accuracy as of now)</w:t>
       </w:r>
     </w:p>
     <w:p>
@@ -1181,7 +1191,7 @@
     <w:p>
       <w:r>
         <w:pict w14:anchorId="21A289E2">
-          <v:rect id="_x0000_i1044" style="width:0;height:0" o:hralign="center" o:hrstd="t" o:hr="t" fillcolor="#a0a0a0" stroked="f"/>
+          <v:rect id="_x0000_i1026" style="width:0;height:0" o:hralign="center" o:hrstd="t" o:hr="t" fillcolor="#a0a0a0" stroked="f"/>
         </w:pict>
       </w:r>
     </w:p>
@@ -1639,7 +1649,7 @@
     <w:p>
       <w:r>
         <w:pict w14:anchorId="73906E40">
-          <v:rect id="_x0000_i1045" style="width:0;height:0" o:hralign="center" o:hrstd="t" o:hr="t" fillcolor="#a0a0a0" stroked="f"/>
+          <v:rect id="_x0000_i1027" style="width:0;height:0" o:hralign="center" o:hrstd="t" o:hr="t" fillcolor="#a0a0a0" stroked="f"/>
         </w:pict>
       </w:r>
     </w:p>
@@ -1717,6 +1727,2402 @@
       </w:r>
     </w:p>
     <w:p/>
+    <w:p/>
+    <w:p>
+      <w:r>
+        <w:lastRenderedPageBreak/>
+        <w:t>Fixes:</w:t>
+      </w:r>
+    </w:p>
+    <w:p>
+      <w:pPr>
+        <w:rPr>
+          <w:b/>
+          <w:bCs/>
+          <w:color w:val="EE0000"/>
+        </w:rPr>
+      </w:pPr>
+      <w:r>
+        <w:rPr>
+          <w:b/>
+          <w:bCs/>
+          <w:color w:val="EE0000"/>
+        </w:rPr>
+        <w:t>Fix 2 — Replace Mean Pool with CLS Token</w:t>
+      </w:r>
+    </w:p>
+    <w:p>
+      <w:r>
+        <w:t>python</w:t>
+      </w:r>
+    </w:p>
+    <w:p>
+      <w:r>
+        <w:t># Instead of averaging all frames:</w:t>
+      </w:r>
+    </w:p>
+    <w:p>
+      <w:r>
+        <w:t>feat = x.mean(dim=1)      ← loses order</w:t>
+      </w:r>
+    </w:p>
+    <w:p>
+      <w:r>
+        <w:t> </w:t>
+      </w:r>
+    </w:p>
+    <w:p>
+      <w:r>
+        <w:t># Add a learnable CLS token (like BERT):</w:t>
+      </w:r>
+    </w:p>
+    <w:p>
+      <w:r>
+        <w:t>self.cls_token = nn.Parameter(torch.zeros(1, 1, d_model))</w:t>
+      </w:r>
+    </w:p>
+    <w:p>
+      <w:r>
+        <w:t> </w:t>
+      </w:r>
+    </w:p>
+    <w:p>
+      <w:r>
+        <w:t>def forward(self, x):</w:t>
+      </w:r>
+    </w:p>
+    <w:p>
+      <w:r>
+        <w:t xml:space="preserve">    cls = self.cls_token.expand(x.size(0), -1, -1)</w:t>
+      </w:r>
+    </w:p>
+    <w:p>
+      <w:r>
+        <w:t xml:space="preserve">    x   = torch.cat([cls, x], dim=1)   # prepend CLS</w:t>
+      </w:r>
+    </w:p>
+    <w:p>
+      <w:r>
+        <w:t xml:space="preserve">    x   = self.transformer(x)</w:t>
+      </w:r>
+    </w:p>
+    <w:p>
+      <w:r>
+        <w:t xml:space="preserve">    feat = x[:, 0]    # only use CLS output, not mean</w:t>
+      </w:r>
+    </w:p>
+    <w:p>
+      <w:r>
+        <w:t>The CLS token attends to ALL frames and learns to summarise the sequence in a direction-aware way — it sees both start and end context.</w:t>
+      </w:r>
+    </w:p>
+    <w:p>
+      <w:pPr>
+        <w:rPr>
+          <w:b/>
+          <w:bCs/>
+          <w:color w:val="EE0000"/>
+        </w:rPr>
+      </w:pPr>
+      <w:r>
+        <w:rPr>
+          <w:b/>
+          <w:bCs/>
+          <w:color w:val="EE0000"/>
+        </w:rPr>
+        <w:t>Fix 3 — Concatenate Start + End Frame Features</w:t>
+      </w:r>
+    </w:p>
+    <w:p>
+      <w:r>
+        <w:t>Quick, cheap fix — explicitly give the model the trajectory:</w:t>
+      </w:r>
+    </w:p>
+    <w:p>
+      <w:r>
+        <w:t>python</w:t>
+      </w:r>
+    </w:p>
+    <w:p>
+      <w:r>
+        <w:t>def forward(self, x):</w:t>
+      </w:r>
+    </w:p>
+    <w:p>
+      <w:r>
+        <w:t xml:space="preserve">    x    = self.transformer(x)</w:t>
+      </w:r>
+    </w:p>
+    <w:p>
+      <w:r>
+        <w:t xml:space="preserve">    mean = x.mean(dim=1)          # [B, 128] overall context</w:t>
+      </w:r>
+    </w:p>
+    <w:p>
+      <w:r>
+        <w:t xml:space="preserve">    start = x[:, 0]               # [B, 128] beginning of sign  </w:t>
+      </w:r>
+    </w:p>
+    <w:p>
+      <w:r>
+        <w:t xml:space="preserve">    end   = x[:, -1]              # [B, 128] end of sign</w:t>
+      </w:r>
+    </w:p>
+    <w:p>
+      <w:r>
+        <w:t xml:space="preserve">    feat = torch.cat([mean, start, end], dim=1)   # [B, 384]</w:t>
+      </w:r>
+    </w:p>
+    <w:p>
+      <w:r>
+        <w:t xml:space="preserve">    # Update classifier input_dim: 384 instead of 128</w:t>
+      </w:r>
+    </w:p>
+    <w:p>
+      <w:r>
+        <w:lastRenderedPageBreak/>
+        <w:t>This tells the model "here is where the hand started and where it ended" — directly encoding movement direction.</w:t>
+      </w:r>
+    </w:p>
+    <w:p>
+      <w:r>
+        <w:t xml:space="preserve">  </w:t>
+      </w:r>
+      <w:r>
+        <w:rPr>
+          <w:b/>
+          <w:bCs/>
+        </w:rPr>
+        <w:t>Destroy the Memorization:</w:t>
+      </w:r>
+      <w:r>
+        <w:t xml:space="preserve"> Apply </w:t>
+      </w:r>
+      <w:r>
+        <w:rPr>
+          <w:b/>
+          <w:bCs/>
+        </w:rPr>
+        <w:t>Targeted Augmentation</w:t>
+      </w:r>
+      <w:r>
+        <w:t xml:space="preserve"> (spatial jitter and temporal scaling) to the dataset.</w:t>
+      </w:r>
+    </w:p>
+    <w:p>
+      <w:pPr>
+        <w:rPr>
+          <w:b/>
+          <w:bCs/>
+        </w:rPr>
+      </w:pPr>
+      <w:r>
+        <w:rPr>
+          <w:b/>
+          <w:bCs/>
+        </w:rPr>
+        <w:t>The Winner: Targeted Augmentation</w:t>
+      </w:r>
+    </w:p>
+    <w:p>
+      <w:r>
+        <w:t xml:space="preserve">If your primary goal is to close that massive 16–18% gap between your Validation and Test accuracy, </w:t>
+      </w:r>
+      <w:r>
+        <w:rPr>
+          <w:b/>
+          <w:bCs/>
+        </w:rPr>
+        <w:t>Targeted Augmentation</w:t>
+      </w:r>
+      <w:r>
+        <w:t xml:space="preserve"> is the undisputed champion.</w:t>
+      </w:r>
+    </w:p>
+    <w:p>
+      <w:pPr>
+        <w:numPr>
+          <w:ilvl w:val="0"/>
+          <w:numId w:val="2"/>
+        </w:numPr>
+      </w:pPr>
+      <w:r>
+        <w:rPr>
+          <w:b/>
+          <w:bCs/>
+        </w:rPr>
+        <w:t>Estimated Impact:</w:t>
+      </w:r>
+      <w:r>
+        <w:t xml:space="preserve"> +3.0% to +5.0% Test Accuracy.</w:t>
+      </w:r>
+    </w:p>
+    <w:p>
+      <w:pPr>
+        <w:numPr>
+          <w:ilvl w:val="0"/>
+          <w:numId w:val="2"/>
+        </w:numPr>
+      </w:pPr>
+      <w:r>
+        <w:rPr>
+          <w:b/>
+          <w:bCs/>
+        </w:rPr>
+        <w:t>The Reality Check:</w:t>
+      </w:r>
+      <w:r>
+        <w:t xml:space="preserve"> Right now, your model is practically "memorizing" the exact bone lengths, shoulder widths, and resting postures of the signers in your training set.</w:t>
+      </w:r>
+    </w:p>
+    <w:p>
+      <w:pPr>
+        <w:numPr>
+          <w:ilvl w:val="0"/>
+          <w:numId w:val="2"/>
+        </w:numPr>
+      </w:pPr>
+      <w:r>
+        <w:rPr>
+          <w:b/>
+          <w:bCs/>
+        </w:rPr>
+        <w:t>Why it wins:</w:t>
+      </w:r>
+      <w:r>
+        <w:t xml:space="preserve"> By applying random geometric jitter (adding slight noise to coordinates), scaling (simulating different camera distances), and temporal dropping (simulating different signing speeds), you actively destroy the model's ability to memorize the signers. You force it to learn the </w:t>
+      </w:r>
+      <w:r>
+        <w:rPr>
+          <w:i/>
+          <w:iCs/>
+        </w:rPr>
+        <w:t>universal geometry of the sign itself</w:t>
+      </w:r>
+      <w:r>
+        <w:t>. This directly attacks your biggest source of error.</w:t>
+      </w:r>
+    </w:p>
+    <w:p/>
+    <w:p>
+      <w:r>
+        <w:t xml:space="preserve">  </w:t>
+      </w:r>
+      <w:r>
+        <w:rPr>
+          <w:b/>
+          <w:bCs/>
+        </w:rPr>
+        <w:t>Separate the Clusters (Optional):</w:t>
+      </w:r>
+      <w:r>
+        <w:t xml:space="preserve"> If you have the compute budget and training time, turn </w:t>
+      </w:r>
+      <w:r>
+        <w:rPr>
+          <w:b/>
+          <w:bCs/>
+        </w:rPr>
+        <w:t>SupCon</w:t>
+      </w:r>
+      <w:r>
+        <w:t xml:space="preserve"> back on to pull the newly enriched features apart.</w:t>
+      </w:r>
+    </w:p>
+    <w:p>
+      <w:r>
+        <w:t xml:space="preserve">  </w:t>
+      </w:r>
+      <w:r>
+        <w:rPr>
+          <w:b/>
+          <w:bCs/>
+        </w:rPr>
+        <w:t>The Reality Check:</w:t>
+      </w:r>
+      <w:r>
+        <w:t xml:space="preserve"> You already tried this in your v2 notebook, and it only gave you a +1.0% boost while doubling your training time. Why? Because you were asking SupCon to pull apart W012 and W016 using </w:t>
+      </w:r>
+      <w:r>
+        <w:rPr>
+          <w:i/>
+          <w:iCs/>
+        </w:rPr>
+        <w:t>temporally blind features</w:t>
+      </w:r>
+      <w:r>
+        <w:t>.</w:t>
+      </w:r>
+    </w:p>
+    <w:p>
+      <w:r>
+        <w:t xml:space="preserve">  </w:t>
+      </w:r>
+      <w:r>
+        <w:rPr>
+          <w:b/>
+          <w:bCs/>
+        </w:rPr>
+        <w:t>Why it's in second place:</w:t>
+      </w:r>
+      <w:r>
+        <w:t xml:space="preserve"> If you implement the </w:t>
+      </w:r>
+      <w:r>
+        <w:rPr>
+          <w:b/>
+          <w:bCs/>
+        </w:rPr>
+        <w:t>Velocity features</w:t>
+      </w:r>
+      <w:r>
+        <w:t xml:space="preserve"> we discussed earlier, SupCon will suddenly become vastly more powerful. Once the features actually contain the direction of movement, SupCon will easily pull those confusing classes apart in the latent space. But on its own, without fixing the features or adding augmentation, its impact is bottlenecked.</w:t>
+      </w:r>
+    </w:p>
+    <w:p/>
+    <w:p/>
+    <w:p/>
+    <w:p/>
+    <w:p/>
+    <w:p>
+      <w:r>
+        <w:lastRenderedPageBreak/>
+        <w:t>KNOWLEDGE DISTILATION</w:t>
+      </w:r>
+    </w:p>
+    <w:p>
+      <w:pPr>
+        <w:rPr>
+          <w:color w:val="EE0000"/>
+        </w:rPr>
+      </w:pPr>
+    </w:p>
+    <w:p>
+      <w:pPr>
+        <w:rPr>
+          <w:b/>
+          <w:bCs/>
+          <w:color w:val="EE0000"/>
+        </w:rPr>
+      </w:pPr>
+      <w:r>
+        <w:rPr>
+          <w:b/>
+          <w:bCs/>
+          <w:color w:val="EE0000"/>
+        </w:rPr>
+        <w:t>Architecture C — Pre-extract + Fuse (Your New Idea)</w:t>
+      </w:r>
+    </w:p>
+    <w:p>
+      <w:r>
+        <w:t>OFFLINE (once):</w:t>
+      </w:r>
+    </w:p>
+    <w:p>
+      <w:r>
+        <w:t xml:space="preserve">  All videos → VideoMAE → save [B,768] features to .npz</w:t>
+      </w:r>
+    </w:p>
+    <w:p>
+      <w:r>
+        <w:t> </w:t>
+      </w:r>
+    </w:p>
+    <w:p>
+      <w:r>
+        <w:t>TRAINING:</w:t>
+      </w:r>
+    </w:p>
+    <w:p>
+      <w:r>
+        <w:t xml:space="preserve">  VideoMAE features [B,768] (loaded from .npz) ──┐</w:t>
+      </w:r>
+    </w:p>
+    <w:p>
+      <w:r>
+        <w:t xml:space="preserve">                                                   </w:t>
+      </w:r>
+      <w:r>
+        <w:rPr>
+          <w:rFonts w:ascii="MS Gothic" w:eastAsia="MS Gothic" w:hAnsi="MS Gothic" w:cs="MS Gothic" w:hint="eastAsia"/>
+        </w:rPr>
+        <w:t>├</w:t>
+      </w:r>
+      <w:r>
+        <w:rPr>
+          <w:rFonts w:ascii="Calibri" w:hAnsi="Calibri" w:cs="Calibri"/>
+        </w:rPr>
+        <w:t>─</w:t>
+      </w:r>
+      <w:r>
+        <w:t xml:space="preserve"> Fusion </w:t>
+      </w:r>
+      <w:r>
+        <w:rPr>
+          <w:rFonts w:ascii="Calibri" w:hAnsi="Calibri" w:cs="Calibri"/>
+        </w:rPr>
+        <w:t>→</w:t>
+      </w:r>
+      <w:r>
+        <w:t xml:space="preserve"> [B,30]</w:t>
+      </w:r>
+    </w:p>
+    <w:p>
+      <w:r>
+        <w:t xml:space="preserve">  Keypoints        [B,200,150]                  ──┘</w:t>
+      </w:r>
+    </w:p>
+    <w:p>
+      <w:r>
+        <w:t xml:space="preserve">  + distillation loss on keypoint branch alone</w:t>
+      </w:r>
+    </w:p>
+    <w:p>
+      <w:r>
+        <w:t> </w:t>
+      </w:r>
+    </w:p>
+    <w:p>
+      <w:r>
+        <w:t>INFERENCE option 1:  use both → best accuracy</w:t>
+      </w:r>
+    </w:p>
+    <w:p>
+      <w:r>
+        <w:t>INFERENCE option 2:  keypoints only → decent accuracy</w:t>
+      </w:r>
+    </w:p>
+    <w:p>
+      <w:r>
+        <w:rPr>
+          <w:b/>
+          <w:bCs/>
+        </w:rPr>
+        <w:t>Pros:</w:t>
+      </w:r>
+      <w:r>
+        <w:t> No VideoMAE running during training (fast), two inference modes</w:t>
+      </w:r>
+      <w:r>
+        <w:br/>
+      </w:r>
+      <w:r>
+        <w:rPr>
+          <w:b/>
+          <w:bCs/>
+        </w:rPr>
+        <w:t>Cons:</w:t>
+      </w:r>
+      <w:r>
+        <w:t> Still needs video at inference for option 1</w:t>
+      </w:r>
+    </w:p>
+    <w:p/>
+    <w:p>
+      <w:r>
+        <w:t xml:space="preserve">That is a fantastic, highly practical question. You are entirely right that standard fine-tuning is your baseline. You </w:t>
+      </w:r>
+      <w:r>
+        <w:rPr>
+          <w:i/>
+          <w:iCs/>
+        </w:rPr>
+        <w:t>should</w:t>
+      </w:r>
+      <w:r>
+        <w:t xml:space="preserve"> start by simply fine-tuning the pre-trained X3D-XS on your sign language dataset.</w:t>
+      </w:r>
+    </w:p>
+    <w:p>
+      <w:r>
+        <w:t>However, fine-tuning alone will likely plateau significantly lower than your VideoMAE's 90% accuracy. Here is exactly why adding Knowledge Distillation (KD) on top of fine-tuning is the secret to pushing a tiny 3.8M parameter model to perform like a massive Transformer.</w:t>
+      </w:r>
+    </w:p>
+    <w:p>
+      <w:pPr>
+        <w:rPr>
+          <w:b/>
+          <w:bCs/>
+        </w:rPr>
+      </w:pPr>
+      <w:r>
+        <w:rPr>
+          <w:b/>
+          <w:bCs/>
+        </w:rPr>
+        <w:t>1. The Power of "Dark Knowledge" (Soft Labels)</w:t>
+      </w:r>
+    </w:p>
+    <w:p>
+      <w:r>
+        <w:t>When you standardly fine-tune a model, you use "hard labels" (e.g., 100% for the sign "Thank You", 0% for every other sign).</w:t>
+      </w:r>
+    </w:p>
+    <w:p>
+      <w:r>
+        <w:lastRenderedPageBreak/>
+        <w:t xml:space="preserve">The problem is that sign language has massive </w:t>
+      </w:r>
+      <w:r>
+        <w:rPr>
+          <w:b/>
+          <w:bCs/>
+        </w:rPr>
+        <w:t>inter-class similarity</w:t>
+      </w:r>
+      <w:r>
+        <w:t>. The sign for "Thank You" might look visually very similar to "Good". Hard labels teach the model nothing about this similarity.</w:t>
+      </w:r>
+    </w:p>
+    <w:p>
+      <w:r>
+        <w:t xml:space="preserve">When you use VideoMAE as a teacher, you train the student on the teacher's </w:t>
+      </w:r>
+      <w:r>
+        <w:rPr>
+          <w:b/>
+          <w:bCs/>
+        </w:rPr>
+        <w:t>soft logits</w:t>
+      </w:r>
+      <w:r>
+        <w:t xml:space="preserve">. The teacher might say: </w:t>
+      </w:r>
+      <w:r>
+        <w:rPr>
+          <w:i/>
+          <w:iCs/>
+        </w:rPr>
+        <w:t>"I am 85% sure this is 'Thank You', but it has a 12% resemblance to 'Good', and 0% resemblance to 'Car'."</w:t>
+      </w:r>
+      <w:r>
+        <w:t xml:space="preserve"> This rich, secondary information is called "Dark Knowledge." It teaches the tiny X3D model the underlying relationship between different gestures, making it generalize vastly better than if it only learned from 1s and 0s.</w:t>
+      </w:r>
+    </w:p>
+    <w:p>
+      <w:pPr>
+        <w:rPr>
+          <w:b/>
+          <w:bCs/>
+        </w:rPr>
+      </w:pPr>
+      <w:r>
+        <w:rPr>
+          <w:b/>
+          <w:bCs/>
+        </w:rPr>
+        <w:t>2. Overcoming Parameter Constraints (Capacity)</w:t>
+      </w:r>
+    </w:p>
+    <w:p>
+      <w:r>
+        <w:t>Your VideoMAE likely has anywhere from 86 million to over 300 million parameters. X3D-XS has 3.8 million.</w:t>
+      </w:r>
+    </w:p>
+    <w:p>
+      <w:r>
+        <w:t>Because X3D-XS is so small, if you just fine-tune it from scratch on complex sign language data, it might struggle to find a clean mathematical boundary between difficult classes. It lacks the "brain capacity" to figure out the optimal solution alone.</w:t>
+      </w:r>
+    </w:p>
+    <w:p>
+      <w:r>
+        <w:t>VideoMAE has already done the heavy lifting. It mapped out a highly accurate, smooth decision boundary. Distillation acts as a powerful regularizer—it essentially grabs the small model by the hand and forces its weights to align with the highly optimized solution the massive Transformer already found.</w:t>
+      </w:r>
+    </w:p>
+    <w:p>
+      <w:pPr>
+        <w:rPr>
+          <w:b/>
+          <w:bCs/>
+        </w:rPr>
+      </w:pPr>
+      <w:r>
+        <w:rPr>
+          <w:b/>
+          <w:bCs/>
+        </w:rPr>
+        <w:t>3. Transferring "Global" Context to a "Local" Model</w:t>
+      </w:r>
+    </w:p>
+    <w:p>
+      <w:r>
+        <w:t>Transformers (VideoMAE) and 3D CNNs (X3D) process video fundamentally differently:</w:t>
+      </w:r>
+    </w:p>
+    <w:p>
+      <w:pPr>
+        <w:numPr>
+          <w:ilvl w:val="0"/>
+          <w:numId w:val="3"/>
+        </w:numPr>
+      </w:pPr>
+      <w:r>
+        <w:rPr>
+          <w:b/>
+          <w:bCs/>
+        </w:rPr>
+        <w:t>VideoMAE</w:t>
+      </w:r>
+      <w:r>
+        <w:t xml:space="preserve"> uses self-attention, meaning it can look at a hand gesture in frame 1 and instantly correlate it with a facial expression in frame 30 (Global context).</w:t>
+      </w:r>
+    </w:p>
+    <w:p>
+      <w:pPr>
+        <w:numPr>
+          <w:ilvl w:val="0"/>
+          <w:numId w:val="3"/>
+        </w:numPr>
+      </w:pPr>
+      <w:r>
+        <w:rPr>
+          <w:b/>
+          <w:bCs/>
+        </w:rPr>
+        <w:t>X3D</w:t>
+      </w:r>
+      <w:r>
+        <w:t xml:space="preserve"> uses convolutions, meaning it can only process small, localized patches of video at a time, slowly building up a bigger picture (Local context).</w:t>
+      </w:r>
+    </w:p>
+    <w:p>
+      <w:r>
+        <w:t>By forcing the local 3D CNN to mimic the predictions of the global Transformer, you indirectly transfer the Transformer's global spatiotemporal awareness into the CNN's weights. You are tricking the CNN into "seeing" the whole video contextually, without paying the massive parameter cost of self-attention layers.</w:t>
+      </w:r>
+    </w:p>
+    <w:p>
+      <w:pPr>
+        <w:rPr>
+          <w:b/>
+          <w:bCs/>
+        </w:rPr>
+      </w:pPr>
+      <w:r>
+        <w:rPr>
+          <w:b/>
+          <w:bCs/>
+        </w:rPr>
+        <w:t>The Bottom Line</w:t>
+      </w:r>
+    </w:p>
+    <w:p>
+      <w:pPr>
+        <w:numPr>
+          <w:ilvl w:val="0"/>
+          <w:numId w:val="4"/>
+        </w:numPr>
+      </w:pPr>
+      <w:r>
+        <w:rPr>
+          <w:b/>
+          <w:bCs/>
+        </w:rPr>
+        <w:t>Fine-tuning</w:t>
+      </w:r>
+      <w:r>
+        <w:t xml:space="preserve"> gives the X3D model the vocabulary of your dataset.</w:t>
+      </w:r>
+    </w:p>
+    <w:p>
+      <w:pPr>
+        <w:numPr>
+          <w:ilvl w:val="0"/>
+          <w:numId w:val="4"/>
+        </w:numPr>
+      </w:pPr>
+      <w:r>
+        <w:rPr>
+          <w:b/>
+          <w:bCs/>
+        </w:rPr>
+        <w:t>Distillation</w:t>
+      </w:r>
+      <w:r>
+        <w:t xml:space="preserve"> transfers the deep, contextual wisdom of the VideoMAE into the X3D model.</w:t>
+      </w:r>
+    </w:p>
+    <w:p>
+      <w:r>
+        <w:lastRenderedPageBreak/>
+        <w:t xml:space="preserve">If you want the absolute highest accuracy for your 3.8M parameters, you fine-tune </w:t>
+      </w:r>
+      <w:r>
+        <w:rPr>
+          <w:i/>
+          <w:iCs/>
+        </w:rPr>
+        <w:t>using</w:t>
+      </w:r>
+      <w:r>
+        <w:t xml:space="preserve"> the distillation loss function.</w:t>
+      </w:r>
+    </w:p>
+    <w:p>
+      <w:r>
+        <w:t>Hitting 90% test accuracy with VideoMAE on a sign language dataset is a massive achievement—those models are powerful, but taming them requires serious effort. The drop to 52% on the keypoint-based Transformer is also completely expected. In sign language recognition, particularly with rich, localized gestures, pure keypoint coordinates often fail to capture the crucial micro-textures: the overlapping of fingers, hand shapes, and subtle facial expressions.</w:t>
+      </w:r>
+    </w:p>
+    <w:p>
+      <w:r>
+        <w:t xml:space="preserve">To achieve your goal of bridging that performance gap while keeping the parameter count strictly constrained, </w:t>
+      </w:r>
+      <w:r>
+        <w:rPr>
+          <w:b/>
+          <w:bCs/>
+        </w:rPr>
+        <w:t>Approach 2 (Hybrid/Dual-Pipeline) is definitively the better choice.</w:t>
+      </w:r>
+    </w:p>
+    <w:p>
+      <w:r>
+        <w:t>Here is a breakdown of why Approach 1 will likely fail, exactly which lightweight models you should target, and how to architect the distillation and fusion strategy.</w:t>
+      </w:r>
+    </w:p>
+    <w:p>
+      <w:pPr>
+        <w:rPr>
+          <w:b/>
+          <w:bCs/>
+        </w:rPr>
+      </w:pPr>
+      <w:r>
+        <w:rPr>
+          <w:b/>
+          <w:bCs/>
+        </w:rPr>
+        <w:t>Why Approach 1 (Direct Distillation) is a Trap</w:t>
+      </w:r>
+    </w:p>
+    <w:p>
+      <w:r>
+        <w:t xml:space="preserve">Distilling directly from VideoMAE to a Keypoint Transformer forces you to cross a massive </w:t>
+      </w:r>
+      <w:r>
+        <w:rPr>
+          <w:b/>
+          <w:bCs/>
+        </w:rPr>
+        <w:t>modality gap</w:t>
+      </w:r>
+      <w:r>
+        <w:t>.</w:t>
+      </w:r>
+    </w:p>
+    <w:p>
+      <w:pPr>
+        <w:numPr>
+          <w:ilvl w:val="0"/>
+          <w:numId w:val="5"/>
+        </w:numPr>
+      </w:pPr>
+      <w:r>
+        <w:rPr>
+          <w:b/>
+          <w:bCs/>
+        </w:rPr>
+        <w:t>The Teacher (VideoMAE)</w:t>
+      </w:r>
+      <w:r>
+        <w:t xml:space="preserve"> learns dense, contextual representations from RGB patches. It understands texture, lighting, and spatial continuity.</w:t>
+      </w:r>
+    </w:p>
+    <w:p>
+      <w:pPr>
+        <w:numPr>
+          <w:ilvl w:val="0"/>
+          <w:numId w:val="5"/>
+        </w:numPr>
+      </w:pPr>
+      <w:r>
+        <w:rPr>
+          <w:b/>
+          <w:bCs/>
+        </w:rPr>
+        <w:t>The Student (Keypoints)</w:t>
+      </w:r>
+      <w:r>
+        <w:t xml:space="preserve"> lives in a sparse mathematical space of $X, Y, Z$ coordinates.</w:t>
+      </w:r>
+    </w:p>
+    <w:p>
+      <w:r>
+        <w:t xml:space="preserve">If you try to distill logits directly, the student lacks the sensory input (pixels) to understand </w:t>
+      </w:r>
+      <w:r>
+        <w:rPr>
+          <w:i/>
+          <w:iCs/>
+        </w:rPr>
+        <w:t>why</w:t>
+      </w:r>
+      <w:r>
+        <w:t xml:space="preserve"> the teacher is making its predictions. Furthermore, bridging a 38% accuracy gap usually results in the student underfitting because it lacks the capacity to mimic the teacher's complex decision boundaries.</w:t>
+      </w:r>
+    </w:p>
+    <w:p>
+      <w:r>
+        <w:pict w14:anchorId="069C2FFC">
+          <v:rect id="_x0000_i1028" style="width:0;height:1.5pt" o:hralign="center" o:hrstd="t" o:hrnoshade="t" o:hr="t" fillcolor="gray" stroked="f"/>
+        </w:pict>
+      </w:r>
+    </w:p>
+    <w:p>
+      <w:pPr>
+        <w:rPr>
+          <w:b/>
+          <w:bCs/>
+        </w:rPr>
+      </w:pPr>
+      <w:r>
+        <w:rPr>
+          <w:b/>
+          <w:bCs/>
+        </w:rPr>
+        <w:t>The Champions of Low-Parameter Video Models</w:t>
+      </w:r>
+    </w:p>
+    <w:p>
+      <w:r>
+        <w:t>You asked for a lightweight, non-keypoint video model or 3D CNN that delivers the best accuracy-to-parameter ratio. You have two elite options to serve as your student model:</w:t>
+      </w:r>
+    </w:p>
+    <w:p>
+      <w:r>
+        <w:rPr>
+          <w:b/>
+          <w:bCs/>
+        </w:rPr>
+        <w:t>1. X3D (Specifically X3D-XS)</w:t>
+      </w:r>
+    </w:p>
+    <w:p>
+      <w:pPr>
+        <w:numPr>
+          <w:ilvl w:val="0"/>
+          <w:numId w:val="6"/>
+        </w:numPr>
+      </w:pPr>
+      <w:r>
+        <w:rPr>
+          <w:b/>
+          <w:bCs/>
+        </w:rPr>
+        <w:t>Architecture:</w:t>
+      </w:r>
+      <w:r>
+        <w:t xml:space="preserve"> 3D CNN.</w:t>
+      </w:r>
+    </w:p>
+    <w:p>
+      <w:pPr>
+        <w:numPr>
+          <w:ilvl w:val="0"/>
+          <w:numId w:val="6"/>
+        </w:numPr>
+      </w:pPr>
+      <w:r>
+        <w:rPr>
+          <w:b/>
+          <w:bCs/>
+        </w:rPr>
+        <w:t>Parameters:</w:t>
+      </w:r>
+      <w:r>
+        <w:t xml:space="preserve"> ~3.8 Million.</w:t>
+      </w:r>
+    </w:p>
+    <w:p>
+      <w:pPr>
+        <w:numPr>
+          <w:ilvl w:val="0"/>
+          <w:numId w:val="6"/>
+        </w:numPr>
+      </w:pPr>
+      <w:r>
+        <w:rPr>
+          <w:b/>
+          <w:bCs/>
+        </w:rPr>
+        <w:t>Why it works:</w:t>
+      </w:r>
+      <w:r>
+        <w:t xml:space="preserve"> Meta designed X3D by progressively expanding a tiny 2D image architecture across multiple axes (temporal duration, frame rate, spatial resolution, </w:t>
+      </w:r>
+      <w:r>
+        <w:lastRenderedPageBreak/>
+        <w:t>width, and depth). X3D-XS is aggressively optimized, exceptionally lightweight, and retains excellent spatiotemporal understanding. It is arguably the best "bang for your buck" in standard 3D CNNs.</w:t>
+      </w:r>
+    </w:p>
+    <w:p>
+      <w:r>
+        <w:rPr>
+          <w:b/>
+          <w:bCs/>
+        </w:rPr>
+        <w:t>2. MoViNet (Specifically MoViNet-A0)</w:t>
+      </w:r>
+    </w:p>
+    <w:p>
+      <w:pPr>
+        <w:numPr>
+          <w:ilvl w:val="0"/>
+          <w:numId w:val="7"/>
+        </w:numPr>
+      </w:pPr>
+      <w:r>
+        <w:rPr>
+          <w:b/>
+          <w:bCs/>
+        </w:rPr>
+        <w:t>Architecture:</w:t>
+      </w:r>
+      <w:r>
+        <w:t xml:space="preserve"> Mobile Video Network (3D CNN utilizing Neural Architecture Search).</w:t>
+      </w:r>
+    </w:p>
+    <w:p>
+      <w:pPr>
+        <w:numPr>
+          <w:ilvl w:val="0"/>
+          <w:numId w:val="7"/>
+        </w:numPr>
+      </w:pPr>
+      <w:r>
+        <w:rPr>
+          <w:b/>
+          <w:bCs/>
+        </w:rPr>
+        <w:t>Parameters:</w:t>
+      </w:r>
+      <w:r>
+        <w:t xml:space="preserve"> ~3.1 Million.</w:t>
+      </w:r>
+    </w:p>
+    <w:p>
+      <w:pPr>
+        <w:numPr>
+          <w:ilvl w:val="0"/>
+          <w:numId w:val="7"/>
+        </w:numPr>
+      </w:pPr>
+      <w:r>
+        <w:rPr>
+          <w:b/>
+          <w:bCs/>
+        </w:rPr>
+        <w:t>Why it works:</w:t>
+      </w:r>
+      <w:r>
+        <w:t xml:space="preserve"> Developed by Google, MoViNets use causal convolutions. They are specifically built to be insanely efficient on edge devices and mobile processors while achieving state-of-the-art accuracy at their parameter scale.</w:t>
+      </w:r>
+    </w:p>
+    <w:p>
+      <w:r>
+        <w:rPr>
+          <w:i/>
+          <w:iCs/>
+        </w:rPr>
+        <w:t>Verdict:</w:t>
+      </w:r>
+      <w:r>
+        <w:t xml:space="preserve"> Use </w:t>
+      </w:r>
+      <w:r>
+        <w:rPr>
+          <w:b/>
+          <w:bCs/>
+        </w:rPr>
+        <w:t>X3D-XS</w:t>
+      </w:r>
+      <w:r>
+        <w:t xml:space="preserve"> if you want the highest absolute accuracy threshold in a clip-based setup. Use </w:t>
+      </w:r>
+      <w:r>
+        <w:rPr>
+          <w:b/>
+          <w:bCs/>
+        </w:rPr>
+        <w:t>MoViNet-A0</w:t>
+      </w:r>
+      <w:r>
+        <w:t xml:space="preserve"> if your ultimate goal is streaming, real-time inference on edge hardware.</w:t>
+      </w:r>
+    </w:p>
+    <w:p>
+      <w:r>
+        <w:pict w14:anchorId="30E98B60">
+          <v:rect id="_x0000_i1029" style="width:0;height:1.5pt" o:hralign="center" o:hrstd="t" o:hrnoshade="t" o:hr="t" fillcolor="gray" stroked="f"/>
+        </w:pict>
+      </w:r>
+    </w:p>
+    <w:p>
+      <w:pPr>
+        <w:rPr>
+          <w:b/>
+          <w:bCs/>
+        </w:rPr>
+      </w:pPr>
+      <w:r>
+        <w:rPr>
+          <w:b/>
+          <w:bCs/>
+        </w:rPr>
+        <w:t>Designing the Distillation &amp; Fusion Pipeline</w:t>
+      </w:r>
+    </w:p>
+    <w:p>
+      <w:r>
+        <w:t>To maximize performance, you need a three-stage pipeline: Train the lightweight RGB model via distillation, refine the keypoint model, and fuse them.</w:t>
+      </w:r>
+    </w:p>
+    <w:p>
+      <w:pPr>
+        <w:rPr>
+          <w:b/>
+          <w:bCs/>
+        </w:rPr>
+      </w:pPr>
+      <w:r>
+        <w:rPr>
+          <w:b/>
+          <w:bCs/>
+        </w:rPr>
+        <w:t>Phase 1: Distillation (VideoMAE $\rightarrow$ X3D/MoViNet)</w:t>
+      </w:r>
+    </w:p>
+    <w:p>
+      <w:r>
+        <w:t>Because both the teacher and student operate on RGB video, you avoid the modality gap.</w:t>
+      </w:r>
+    </w:p>
+    <w:p>
+      <w:pPr>
+        <w:numPr>
+          <w:ilvl w:val="0"/>
+          <w:numId w:val="8"/>
+        </w:numPr>
+      </w:pPr>
+      <w:r>
+        <w:rPr>
+          <w:b/>
+          <w:bCs/>
+        </w:rPr>
+        <w:t>Logit Distillation:</w:t>
+      </w:r>
+      <w:r>
+        <w:t xml:space="preserve"> Use standard Hinton knowledge distillation. The total loss should be a weighted sum of the standard Cross-Entropy loss (against ground truth labels) and the Kullback-Leibler (KL) divergence (against the teacher's softened logits).</w:t>
+      </w:r>
+    </w:p>
+    <w:p>
+      <w:r>
+        <w:t>$$L = \alpha \mathcal{L}_{CE}(y, \hat{y}_{student}) + (1-\alpha) T^2 \mathcal{L}_{KL}(p_{student} || p_{teacher})$$</w:t>
+      </w:r>
+    </w:p>
+    <w:p>
+      <w:r>
+        <w:rPr>
+          <w:i/>
+          <w:iCs/>
+        </w:rPr>
+        <w:t>Tip:</w:t>
+      </w:r>
+      <w:r>
+        <w:t xml:space="preserve"> Set the temperature $T$ relatively high (e.g., 3 to 5) because VideoMAE's confidence distributions are likely very sharp.</w:t>
+      </w:r>
+    </w:p>
+    <w:p>
+      <w:pPr>
+        <w:rPr>
+          <w:b/>
+          <w:bCs/>
+        </w:rPr>
+      </w:pPr>
+      <w:r>
+        <w:rPr>
+          <w:b/>
+          <w:bCs/>
+        </w:rPr>
+        <w:t>Phase 2: The Keypoint Pipeline</w:t>
+      </w:r>
+    </w:p>
+    <w:p>
+      <w:r>
+        <w:t>Keep your existing keypoint-based Transformer. Do not bother trying to distill VideoMAE into this; just ensure it is well-trained on your ground truth data to act as a specialized "skeleton dynamics" expert.</w:t>
+      </w:r>
+    </w:p>
+    <w:p>
+      <w:pPr>
+        <w:rPr>
+          <w:b/>
+          <w:bCs/>
+        </w:rPr>
+      </w:pPr>
+      <w:r>
+        <w:rPr>
+          <w:b/>
+          <w:bCs/>
+        </w:rPr>
+        <w:t>Phase 3: Fusion Strategy</w:t>
+      </w:r>
+    </w:p>
+    <w:p>
+      <w:r>
+        <w:lastRenderedPageBreak/>
+        <w:t>You now have a Distilled RGB Student (texture/appearance expert) and a Keypoint Transformer (spatial dynamics expert).</w:t>
+      </w:r>
+    </w:p>
+    <w:p>
+      <w:pPr>
+        <w:numPr>
+          <w:ilvl w:val="0"/>
+          <w:numId w:val="9"/>
+        </w:numPr>
+      </w:pPr>
+      <w:r>
+        <w:rPr>
+          <w:b/>
+          <w:bCs/>
+        </w:rPr>
+        <w:t>Lowest Parameter Option (Late Fusion):</w:t>
+      </w:r>
+      <w:r>
+        <w:t xml:space="preserve"> Simply average the output logits of both models before the final softmax. This adds </w:t>
+      </w:r>
+      <w:r>
+        <w:rPr>
+          <w:b/>
+          <w:bCs/>
+        </w:rPr>
+        <w:t>zero parameters</w:t>
+      </w:r>
+      <w:r>
+        <w:t xml:space="preserve"> to your system and provides a robust, ensemble-like accuracy boost.</w:t>
+      </w:r>
+    </w:p>
+    <w:p>
+      <w:pPr>
+        <w:numPr>
+          <w:ilvl w:val="0"/>
+          <w:numId w:val="9"/>
+        </w:numPr>
+      </w:pPr>
+      <w:r>
+        <w:rPr>
+          <w:b/>
+          <w:bCs/>
+        </w:rPr>
+        <w:t>Highest Accuracy Option (Attention-based Mid/Late Fusion):</w:t>
+      </w:r>
+      <w:r>
+        <w:t xml:space="preserve"> Strip the final classification heads off both models. Concatenate the final feature vector from the X3D model with the final token from your Keypoint Transformer. Pass this concatenated vector through a lightweight Multi-Head Cross-Attention layer (or just a simple 2-layer MLP projection head) to let the network learn how to weigh RGB texture against skeleton data dynamically. This adds a trivial number of parameters (usually $&lt; 0.5M$) but yields significantly better accuracy than simple averaging.</w:t>
+      </w:r>
+    </w:p>
+    <w:p>
+      <w:r>
+        <w:t>By using an X3D-XS distilled from your VideoMAE, combined with your Keypoint model via late fusion, you can build a system with under 6 million total parameters that punches well within the weight class of your massive VideoMAE.</w:t>
+      </w:r>
+    </w:p>
+    <w:p>
+      <w:r>
+        <w:t>Are you planning to run this final system in a real-time, streaming inference environment, or will you be operating on pre-segmented, isolated video clips?</w:t>
+      </w:r>
+    </w:p>
+    <w:p/>
+    <w:p/>
+    <w:p>
+      <w:pPr>
+        <w:rPr>
+          <w:b/>
+          <w:bCs/>
+          <w:color w:val="EE0000"/>
+        </w:rPr>
+      </w:pPr>
+      <w:r>
+        <w:rPr>
+          <w:b/>
+          <w:bCs/>
+          <w:color w:val="EE0000"/>
+        </w:rPr>
+        <w:t>1. The Engineering Hack: Cascade Binary "Experts" (Fastest &amp; Surest)</w:t>
+      </w:r>
+    </w:p>
+    <w:p>
+      <w:pPr>
+        <w:rPr>
+          <w:color w:val="EE0000"/>
+        </w:rPr>
+      </w:pPr>
+      <w:r>
+        <w:rPr>
+          <w:color w:val="EE0000"/>
+        </w:rPr>
+        <w:t>If you are already sitting at 70% overall accuracy and just need to fix specific pairs without ruining the rest of the model, do not try to retrain the entire 401-class network. Use a Cascade architecture.</w:t>
+      </w:r>
+    </w:p>
+    <w:p>
+      <w:pPr>
+        <w:numPr>
+          <w:ilvl w:val="0"/>
+          <w:numId w:val="10"/>
+        </w:numPr>
+        <w:rPr>
+          <w:color w:val="EE0000"/>
+        </w:rPr>
+      </w:pPr>
+      <w:r>
+        <w:rPr>
+          <w:b/>
+          <w:bCs/>
+          <w:color w:val="EE0000"/>
+        </w:rPr>
+        <w:t>The Strategy:</w:t>
+      </w:r>
+      <w:r>
+        <w:rPr>
+          <w:color w:val="EE0000"/>
+        </w:rPr>
+        <w:t xml:space="preserve"> Freeze your main model. Find your top 5 worst confused pairs. Train 5 tiny, separate neural networks (or even simple SVMs/Random Forests) that do nothing but classify "Sign A vs. Sign B."</w:t>
+      </w:r>
+    </w:p>
+    <w:p>
+      <w:pPr>
+        <w:numPr>
+          <w:ilvl w:val="0"/>
+          <w:numId w:val="10"/>
+        </w:numPr>
+        <w:rPr>
+          <w:color w:val="EE0000"/>
+        </w:rPr>
+      </w:pPr>
+      <w:r>
+        <w:rPr>
+          <w:b/>
+          <w:bCs/>
+          <w:color w:val="EE0000"/>
+        </w:rPr>
+        <w:t>How to Deploy It:</w:t>
+      </w:r>
+      <w:r>
+        <w:rPr>
+          <w:color w:val="EE0000"/>
+        </w:rPr>
+        <w:t xml:space="preserve"> When your main model outputs a prediction, check if the predicted class belongs to a known confusion pair. If the main model says "I think it's Sign A," you pause. You take those exact same keypoints and route them into the "A vs. B Expert" model.</w:t>
+      </w:r>
+    </w:p>
+    <w:p>
+      <w:pPr>
+        <w:numPr>
+          <w:ilvl w:val="0"/>
+          <w:numId w:val="10"/>
+        </w:numPr>
+        <w:rPr>
+          <w:color w:val="EE0000"/>
+        </w:rPr>
+      </w:pPr>
+      <w:r>
+        <w:rPr>
+          <w:b/>
+          <w:bCs/>
+          <w:color w:val="EE0000"/>
+        </w:rPr>
+        <w:t>Why it's a sure shot:</w:t>
+      </w:r>
+      <w:r>
+        <w:rPr>
+          <w:color w:val="EE0000"/>
+        </w:rPr>
+        <w:t xml:space="preserve"> The Expert model has a vastly simpler loss landscape. It doesn't have to dedicate parameter space to remembering what "Car" or "House" looks like. </w:t>
+      </w:r>
+      <w:r>
+        <w:rPr>
+          <w:color w:val="EE0000"/>
+        </w:rPr>
+        <w:lastRenderedPageBreak/>
+        <w:t>100% of its weights are aggressively optimized to find the microscopic coordinate differences between A and B.</w:t>
+      </w:r>
+    </w:p>
+    <w:p>
+      <w:pPr>
+        <w:rPr>
+          <w:b/>
+          <w:bCs/>
+          <w:color w:val="EE0000"/>
+        </w:rPr>
+      </w:pPr>
+      <w:r>
+        <w:rPr>
+          <w:b/>
+          <w:bCs/>
+          <w:color w:val="EE0000"/>
+        </w:rPr>
+        <w:t>2. The Algorithmic Fix: Supervised Contrastive Learning (SupCon)</w:t>
+      </w:r>
+    </w:p>
+    <w:p>
+      <w:pPr>
+        <w:rPr>
+          <w:color w:val="EE0000"/>
+        </w:rPr>
+      </w:pPr>
+      <w:r>
+        <w:rPr>
+          <w:color w:val="EE0000"/>
+        </w:rPr>
+        <w:t>If you strictly want a single, unified model, standard Cross-Entropy loss will not get you to 90% on confused pairs. Cross-Entropy stops penalizing the model once the correct class has a slightly higher probability than the wrong class. It settles for "good enough."</w:t>
+      </w:r>
+    </w:p>
+    <w:p>
+      <w:pPr>
+        <w:rPr>
+          <w:color w:val="EE0000"/>
+        </w:rPr>
+      </w:pPr>
+      <w:r>
+        <w:rPr>
+          <w:color w:val="EE0000"/>
+        </w:rPr>
+        <w:t xml:space="preserve">You need to use </w:t>
+      </w:r>
+      <w:r>
+        <w:rPr>
+          <w:b/>
+          <w:bCs/>
+          <w:color w:val="EE0000"/>
+        </w:rPr>
+        <w:t>Supervised Contrastive Learning</w:t>
+      </w:r>
+      <w:r>
+        <w:rPr>
+          <w:color w:val="EE0000"/>
+        </w:rPr>
+        <w:t xml:space="preserve"> to explicitly force the model to tear those confused pairs apart in its internal geometry.</w:t>
+      </w:r>
+    </w:p>
+    <w:p>
+      <w:pPr>
+        <w:numPr>
+          <w:ilvl w:val="0"/>
+          <w:numId w:val="11"/>
+        </w:numPr>
+        <w:rPr>
+          <w:color w:val="EE0000"/>
+        </w:rPr>
+      </w:pPr>
+      <w:r>
+        <w:rPr>
+          <w:b/>
+          <w:bCs/>
+          <w:color w:val="EE0000"/>
+        </w:rPr>
+        <w:t>The Strategy:</w:t>
+      </w:r>
+      <w:r>
+        <w:rPr>
+          <w:color w:val="EE0000"/>
+        </w:rPr>
+        <w:t xml:space="preserve"> You add a projection head to your model and apply a contrastive loss function </w:t>
+      </w:r>
+      <w:r>
+        <w:rPr>
+          <w:i/>
+          <w:iCs/>
+          <w:color w:val="EE0000"/>
+        </w:rPr>
+        <w:t>before</w:t>
+      </w:r>
+      <w:r>
+        <w:rPr>
+          <w:color w:val="EE0000"/>
+        </w:rPr>
+        <w:t xml:space="preserve"> the final classification layer.</w:t>
+      </w:r>
+    </w:p>
+    <w:p>
+      <w:pPr>
+        <w:numPr>
+          <w:ilvl w:val="0"/>
+          <w:numId w:val="11"/>
+        </w:numPr>
+        <w:rPr>
+          <w:color w:val="EE0000"/>
+        </w:rPr>
+      </w:pPr>
+      <w:r>
+        <w:rPr>
+          <w:b/>
+          <w:bCs/>
+          <w:color w:val="EE0000"/>
+        </w:rPr>
+        <w:t>How it Works:</w:t>
+      </w:r>
+      <w:r>
+        <w:rPr>
+          <w:color w:val="EE0000"/>
+        </w:rPr>
+        <w:t xml:space="preserve"> In a training batch, you isolate the feature embeddings (the arrays of numbers right before the final prediction).</w:t>
+      </w:r>
+    </w:p>
+    <w:p>
+      <w:pPr>
+        <w:numPr>
+          <w:ilvl w:val="1"/>
+          <w:numId w:val="11"/>
+        </w:numPr>
+        <w:rPr>
+          <w:color w:val="EE0000"/>
+        </w:rPr>
+      </w:pPr>
+      <w:r>
+        <w:rPr>
+          <w:color w:val="EE0000"/>
+        </w:rPr>
+        <w:t>The loss function mathematically pulls the embeddings of all "Sign A" videos tightly together.</w:t>
+      </w:r>
+    </w:p>
+    <w:p>
+      <w:pPr>
+        <w:numPr>
+          <w:ilvl w:val="1"/>
+          <w:numId w:val="11"/>
+        </w:numPr>
+        <w:rPr>
+          <w:color w:val="EE0000"/>
+        </w:rPr>
+      </w:pPr>
+      <w:r>
+        <w:rPr>
+          <w:color w:val="EE0000"/>
+        </w:rPr>
+        <w:t>Simultaneously, it identifies the embedding for "Sign B" (the hard negative) and violently pushes it away in the vector space.</w:t>
+      </w:r>
+    </w:p>
+    <w:p>
+      <w:pPr>
+        <w:numPr>
+          <w:ilvl w:val="0"/>
+          <w:numId w:val="11"/>
+        </w:numPr>
+        <w:rPr>
+          <w:color w:val="EE0000"/>
+        </w:rPr>
+      </w:pPr>
+      <w:r>
+        <w:rPr>
+          <w:b/>
+          <w:bCs/>
+          <w:color w:val="EE0000"/>
+        </w:rPr>
+        <w:t>The Result:</w:t>
+      </w:r>
+      <w:r>
+        <w:rPr>
+          <w:color w:val="EE0000"/>
+        </w:rPr>
+        <w:t xml:space="preserve"> By the time the data reaches the final classification layer, the mathematical distance between Sign A and Sign B is massive, making it nearly impossible for the model to confuse them.</w:t>
+      </w:r>
+    </w:p>
+    <w:p>
+      <w:pPr>
+        <w:rPr>
+          <w:color w:val="EE0000"/>
+        </w:rPr>
+      </w:pPr>
+    </w:p>
+    <w:p>
+      <w:pPr>
+        <w:rPr>
+          <w:color w:val="EE0000"/>
+        </w:rPr>
+      </w:pPr>
+    </w:p>
+    <w:p>
+      <w:pPr>
+        <w:rPr>
+          <w:color w:val="EE0000"/>
+        </w:rPr>
+      </w:pPr>
+    </w:p>
+    <w:p>
+      <w:pPr>
+        <w:rPr>
+          <w:b/>
+          <w:bCs/>
+          <w:color w:val="EE0000"/>
+        </w:rPr>
+      </w:pPr>
+      <w:r>
+        <w:rPr>
+          <w:b/>
+          <w:bCs/>
+          <w:color w:val="EE0000"/>
+        </w:rPr>
+        <w:t>Phase 5: Hardware &amp; Hyperparameter Optimization</w:t>
+      </w:r>
+    </w:p>
+    <w:p>
+      <w:pPr>
+        <w:rPr>
+          <w:color w:val="EE0000"/>
+        </w:rPr>
+      </w:pPr>
+      <w:r>
+        <w:rPr>
+          <w:color w:val="EE0000"/>
+        </w:rPr>
+        <w:t xml:space="preserve">You are using 0.986 M parameters on a 15.6 GB Tesla T4, meaning you have massive VRAM headroom. </w:t>
+      </w:r>
+    </w:p>
+    <w:p>
+      <w:pPr>
+        <w:numPr>
+          <w:ilvl w:val="0"/>
+          <w:numId w:val="12"/>
+        </w:numPr>
+        <w:rPr>
+          <w:color w:val="EE0000"/>
+        </w:rPr>
+      </w:pPr>
+      <w:r>
+        <w:rPr>
+          <w:b/>
+          <w:bCs/>
+          <w:color w:val="EE0000"/>
+        </w:rPr>
+        <w:t>Action 1 (Batch Size):</w:t>
+      </w:r>
+      <w:r>
+        <w:rPr>
+          <w:color w:val="EE0000"/>
+        </w:rPr>
+        <w:t xml:space="preserve"> Change BATCH_SIZE = 64 to BATCH_SIZE = 256. SupCon mathematically requires large batches to supply enough negative pairs to form tight clusters. 64 is too small. </w:t>
+      </w:r>
+    </w:p>
+    <w:p>
+      <w:pPr>
+        <w:numPr>
+          <w:ilvl w:val="0"/>
+          <w:numId w:val="12"/>
+        </w:numPr>
+        <w:rPr>
+          <w:color w:val="EE0000"/>
+        </w:rPr>
+      </w:pPr>
+      <w:r>
+        <w:rPr>
+          <w:b/>
+          <w:bCs/>
+          <w:color w:val="EE0000"/>
+        </w:rPr>
+        <w:t>Action 2 (GRL Tuning):</w:t>
+      </w:r>
+      <w:r>
+        <w:rPr>
+          <w:color w:val="EE0000"/>
+        </w:rPr>
+        <w:t xml:space="preserve"> Your LAMBDA_ADV is at 0.1. With the new Normalization step removing biometric noise, the GRL doesn't have to work as hard, but 0.1 is still too </w:t>
+      </w:r>
+      <w:r>
+        <w:rPr>
+          <w:color w:val="EE0000"/>
+        </w:rPr>
+        <w:lastRenderedPageBreak/>
+        <w:t xml:space="preserve">passive. Increase LAMBDA_ADV to </w:t>
+      </w:r>
+      <w:r>
+        <w:rPr>
+          <w:b/>
+          <w:bCs/>
+          <w:color w:val="EE0000"/>
+        </w:rPr>
+        <w:t>0.25</w:t>
+      </w:r>
+      <w:r>
+        <w:rPr>
+          <w:color w:val="EE0000"/>
+        </w:rPr>
+        <w:t xml:space="preserve"> to ensure the model completely ignores whatever residual signer habits remain. </w:t>
+      </w:r>
+    </w:p>
+    <w:p>
+      <w:pPr>
+        <w:rPr>
+          <w:b/>
+          <w:bCs/>
+          <w:color w:val="EE0000"/>
+        </w:rPr>
+      </w:pPr>
+      <w:r>
+        <w:rPr>
+          <w:b/>
+          <w:bCs/>
+          <w:color w:val="EE0000"/>
+        </w:rPr>
+        <w:t>Phase 4: Upgrade to "Online Hard-Negative" SupCon</w:t>
+      </w:r>
+    </w:p>
+    <w:p>
+      <w:pPr>
+        <w:rPr>
+          <w:color w:val="EE0000"/>
+        </w:rPr>
+      </w:pPr>
+      <w:r>
+        <w:rPr>
+          <w:color w:val="EE0000"/>
+        </w:rPr>
+        <w:t xml:space="preserve">Your current supervised_contrastive_loss function perfectly masks out self-similarity and creates a positive mask for matching labels. It needs a negative penalty multiplier. </w:t>
+      </w:r>
+    </w:p>
+    <w:p>
+      <w:pPr>
+        <w:numPr>
+          <w:ilvl w:val="0"/>
+          <w:numId w:val="13"/>
+        </w:numPr>
+        <w:rPr>
+          <w:color w:val="EE0000"/>
+        </w:rPr>
+      </w:pPr>
+      <w:r>
+        <w:rPr>
+          <w:b/>
+          <w:bCs/>
+          <w:color w:val="EE0000"/>
+        </w:rPr>
+        <w:t>Action:</w:t>
+      </w:r>
+      <w:r>
+        <w:rPr>
+          <w:color w:val="EE0000"/>
+        </w:rPr>
+        <w:t xml:space="preserve"> Modify supervised_contrastive_loss to dynamically penalize different labels that are too close in the latent space.</w:t>
+      </w:r>
+    </w:p>
+    <w:p>
+      <w:pPr>
+        <w:numPr>
+          <w:ilvl w:val="0"/>
+          <w:numId w:val="13"/>
+        </w:numPr>
+        <w:rPr>
+          <w:color w:val="EE0000"/>
+        </w:rPr>
+      </w:pPr>
+      <w:r>
+        <w:rPr>
+          <w:b/>
+          <w:bCs/>
+          <w:color w:val="EE0000"/>
+        </w:rPr>
+        <w:t>Logic to Code:</w:t>
+      </w:r>
+    </w:p>
+    <w:p>
+      <w:pPr>
+        <w:numPr>
+          <w:ilvl w:val="1"/>
+          <w:numId w:val="13"/>
+        </w:numPr>
+        <w:rPr>
+          <w:color w:val="EE0000"/>
+        </w:rPr>
+      </w:pPr>
+      <w:r>
+        <w:rPr>
+          <w:color w:val="EE0000"/>
+        </w:rPr>
+        <w:t>Create a negative mask: neg_mask = (lab != lab.T).</w:t>
+      </w:r>
+    </w:p>
+    <w:p>
+      <w:pPr>
+        <w:numPr>
+          <w:ilvl w:val="1"/>
+          <w:numId w:val="13"/>
+        </w:numPr>
+        <w:rPr>
+          <w:color w:val="EE0000"/>
+        </w:rPr>
+      </w:pPr>
+      <w:r>
+        <w:rPr>
+          <w:color w:val="EE0000"/>
+        </w:rPr>
+        <w:t>Find hard negatives: hard_negatives = (sim &gt; 0.85) &amp; neg_mask.</w:t>
+      </w:r>
+    </w:p>
+    <w:p>
+      <w:pPr>
+        <w:numPr>
+          <w:ilvl w:val="1"/>
+          <w:numId w:val="13"/>
+        </w:numPr>
+        <w:rPr>
+          <w:color w:val="EE0000"/>
+        </w:rPr>
+      </w:pPr>
+      <w:r>
+        <w:rPr>
+          <w:color w:val="EE0000"/>
+        </w:rPr>
+        <w:t xml:space="preserve">Apply a multiplier to the similarity matrix </w:t>
+      </w:r>
+      <w:r>
+        <w:rPr>
+          <w:i/>
+          <w:iCs/>
+          <w:color w:val="EE0000"/>
+        </w:rPr>
+        <w:t>before</w:t>
+      </w:r>
+      <w:r>
+        <w:rPr>
+          <w:color w:val="EE0000"/>
+        </w:rPr>
+        <w:t xml:space="preserve"> calculating log_prob: sim[hard_negatives] = sim[hard_negatives] * 5.0 </w:t>
+      </w:r>
+      <w:r>
+        <w:rPr>
+          <w:i/>
+          <w:iCs/>
+          <w:color w:val="EE0000"/>
+        </w:rPr>
+        <w:t>Note: This violently pushes conflicting signs apart in the projection space.</w:t>
+      </w:r>
+    </w:p>
+    <w:p>
+      <w:pPr>
+        <w:rPr>
+          <w:color w:val="EE0000"/>
+        </w:rPr>
+      </w:pPr>
+    </w:p>
+    <w:p>
+      <w:pPr>
+        <w:rPr>
+          <w:color w:val="EE0000"/>
+        </w:rPr>
+      </w:pPr>
+    </w:p>
+    <w:p>
+      <w:pPr>
+        <w:rPr>
+          <w:color w:val="EE0000"/>
+        </w:rPr>
+      </w:pPr>
+      <w:r>
+        <w:rPr>
+          <w:color w:val="EE0000"/>
+        </w:rPr>
+        <w:t>Here is the exact architectural blueprint to upgrade your geo-keypoint-training-v2.ipynb notebook. You can use this list as your master prompt for coding the changes step-by-step.</w:t>
+      </w:r>
+    </w:p>
+    <w:p>
+      <w:pPr>
+        <w:rPr>
+          <w:color w:val="EE0000"/>
+        </w:rPr>
+      </w:pPr>
+      <w:r>
+        <w:rPr>
+          <w:color w:val="EE0000"/>
+        </w:rPr>
+        <w:t xml:space="preserve">This blueprint addresses the missing data constraints, the modality gaps, and the batch inefficiencies currently present in your baseline. </w:t>
+      </w:r>
+    </w:p>
+    <w:p>
+      <w:pPr>
+        <w:rPr>
+          <w:b/>
+          <w:bCs/>
+          <w:color w:val="EE0000"/>
+        </w:rPr>
+      </w:pPr>
+      <w:r>
+        <w:rPr>
+          <w:b/>
+          <w:bCs/>
+          <w:color w:val="EE0000"/>
+        </w:rPr>
+        <w:t>Phase 1: Implement Relative Pose Normalization</w:t>
+      </w:r>
+    </w:p>
+    <w:p>
+      <w:pPr>
+        <w:rPr>
+          <w:color w:val="EE0000"/>
+        </w:rPr>
+      </w:pPr>
+      <w:r>
+        <w:rPr>
+          <w:color w:val="EE0000"/>
+        </w:rPr>
+        <w:t xml:space="preserve">Currently, your BdSLDataset only applies augmentations like temporal dropout and coordinate noise. It does not normalize the skeleton. </w:t>
+      </w:r>
+    </w:p>
+    <w:p>
+      <w:pPr>
+        <w:numPr>
+          <w:ilvl w:val="0"/>
+          <w:numId w:val="14"/>
+        </w:numPr>
+        <w:rPr>
+          <w:color w:val="EE0000"/>
+        </w:rPr>
+      </w:pPr>
+      <w:r>
+        <w:rPr>
+          <w:b/>
+          <w:bCs/>
+          <w:color w:val="EE0000"/>
+        </w:rPr>
+        <w:t>Action:</w:t>
+      </w:r>
+      <w:r>
+        <w:rPr>
+          <w:color w:val="EE0000"/>
+        </w:rPr>
+        <w:t xml:space="preserve"> Add a normalize_pose(seq) method inside the BdSLDataset class.</w:t>
+      </w:r>
+    </w:p>
+    <w:p>
+      <w:pPr>
+        <w:numPr>
+          <w:ilvl w:val="0"/>
+          <w:numId w:val="14"/>
+        </w:numPr>
+        <w:rPr>
+          <w:color w:val="EE0000"/>
+        </w:rPr>
+      </w:pPr>
+      <w:r>
+        <w:rPr>
+          <w:b/>
+          <w:bCs/>
+          <w:color w:val="EE0000"/>
+        </w:rPr>
+        <w:t>Logic to Code:</w:t>
+      </w:r>
+    </w:p>
+    <w:p>
+      <w:pPr>
+        <w:numPr>
+          <w:ilvl w:val="1"/>
+          <w:numId w:val="14"/>
+        </w:numPr>
+        <w:rPr>
+          <w:color w:val="EE0000"/>
+        </w:rPr>
+      </w:pPr>
+      <w:r>
+        <w:rPr>
+          <w:color w:val="EE0000"/>
+        </w:rPr>
+        <w:t>Identify the index of the shoulder midpoint (or neck) in your 223-dimensional array.</w:t>
+      </w:r>
+    </w:p>
+    <w:p>
+      <w:pPr>
+        <w:numPr>
+          <w:ilvl w:val="1"/>
+          <w:numId w:val="14"/>
+        </w:numPr>
+        <w:rPr>
+          <w:color w:val="EE0000"/>
+        </w:rPr>
+      </w:pPr>
+      <w:r>
+        <w:rPr>
+          <w:color w:val="EE0000"/>
+        </w:rPr>
+        <w:t>Subtract the (x, y) coordinates of this midpoint from every other joint's (x, y) coordinates in that specific frame.</w:t>
+      </w:r>
+    </w:p>
+    <w:p>
+      <w:pPr>
+        <w:numPr>
+          <w:ilvl w:val="1"/>
+          <w:numId w:val="14"/>
+        </w:numPr>
+        <w:rPr>
+          <w:color w:val="EE0000"/>
+        </w:rPr>
+      </w:pPr>
+      <w:r>
+        <w:rPr>
+          <w:color w:val="EE0000"/>
+        </w:rPr>
+        <w:lastRenderedPageBreak/>
+        <w:t>Identify the hip midpoint. Calculate the distance between the neck and the hips (Torso Length).</w:t>
+      </w:r>
+    </w:p>
+    <w:p>
+      <w:pPr>
+        <w:numPr>
+          <w:ilvl w:val="1"/>
+          <w:numId w:val="14"/>
+        </w:numPr>
+        <w:rPr>
+          <w:color w:val="EE0000"/>
+        </w:rPr>
+      </w:pPr>
+      <w:r>
+        <w:rPr>
+          <w:color w:val="EE0000"/>
+        </w:rPr>
+        <w:t>Divide all coordinates by this Torso Length.</w:t>
+      </w:r>
+    </w:p>
+    <w:p>
+      <w:pPr>
+        <w:numPr>
+          <w:ilvl w:val="0"/>
+          <w:numId w:val="14"/>
+        </w:numPr>
+        <w:rPr>
+          <w:color w:val="EE0000"/>
+        </w:rPr>
+      </w:pPr>
+      <w:r>
+        <w:rPr>
+          <w:b/>
+          <w:bCs/>
+          <w:color w:val="EE0000"/>
+        </w:rPr>
+        <w:t>Integration:</w:t>
+      </w:r>
+      <w:r>
+        <w:rPr>
+          <w:color w:val="EE0000"/>
+        </w:rPr>
+        <w:t xml:space="preserve"> Call seq = self.normalize_pose(seq) inside __getitem__ </w:t>
+      </w:r>
+      <w:r>
+        <w:rPr>
+          <w:i/>
+          <w:iCs/>
+          <w:color w:val="EE0000"/>
+        </w:rPr>
+        <w:t>before</w:t>
+      </w:r>
+      <w:r>
+        <w:rPr>
+          <w:color w:val="EE0000"/>
+        </w:rPr>
+        <w:t xml:space="preserve"> applying self.augment_seq(seq). </w:t>
+      </w:r>
+    </w:p>
+    <w:p>
+      <w:pPr>
+        <w:rPr>
+          <w:b/>
+          <w:bCs/>
+          <w:color w:val="EE0000"/>
+        </w:rPr>
+      </w:pPr>
+      <w:r>
+        <w:rPr>
+          <w:b/>
+          <w:bCs/>
+          <w:color w:val="EE0000"/>
+        </w:rPr>
+        <w:t>Phase 2: Integrate Teacher Logits (Logit KD Prep)</w:t>
+      </w:r>
+    </w:p>
+    <w:p>
+      <w:pPr>
+        <w:rPr>
+          <w:color w:val="EE0000"/>
+        </w:rPr>
+      </w:pPr>
+      <w:r>
+        <w:rPr>
+          <w:color w:val="EE0000"/>
+        </w:rPr>
+        <w:t xml:space="preserve">Your dataloader currently returns (X, y, signer_id). You need it to return the Teacher's knowledge as well. </w:t>
+      </w:r>
+    </w:p>
+    <w:p>
+      <w:pPr>
+        <w:numPr>
+          <w:ilvl w:val="0"/>
+          <w:numId w:val="15"/>
+        </w:numPr>
+        <w:rPr>
+          <w:color w:val="EE0000"/>
+        </w:rPr>
+      </w:pPr>
+      <w:r>
+        <w:rPr>
+          <w:b/>
+          <w:bCs/>
+          <w:color w:val="EE0000"/>
+        </w:rPr>
+        <w:t>Action:</w:t>
+      </w:r>
+      <w:r>
+        <w:rPr>
+          <w:color w:val="EE0000"/>
+        </w:rPr>
+        <w:t xml:space="preserve"> Modify BdSLDataset to load a pre-saved .npy file containing the 90% X3D model's raw logits.</w:t>
+      </w:r>
+    </w:p>
+    <w:p>
+      <w:pPr>
+        <w:numPr>
+          <w:ilvl w:val="0"/>
+          <w:numId w:val="15"/>
+        </w:numPr>
+        <w:rPr>
+          <w:color w:val="EE0000"/>
+        </w:rPr>
+      </w:pPr>
+      <w:r>
+        <w:rPr>
+          <w:b/>
+          <w:bCs/>
+          <w:color w:val="EE0000"/>
+        </w:rPr>
+        <w:t>Logic to Code:</w:t>
+      </w:r>
+    </w:p>
+    <w:p>
+      <w:pPr>
+        <w:numPr>
+          <w:ilvl w:val="1"/>
+          <w:numId w:val="15"/>
+        </w:numPr>
+        <w:rPr>
+          <w:color w:val="EE0000"/>
+        </w:rPr>
+      </w:pPr>
+      <w:r>
+        <w:rPr>
+          <w:color w:val="EE0000"/>
+        </w:rPr>
+        <w:t>In __init__, add self.teacher_logits = np.load('x3d_train_logits.npy').</w:t>
+      </w:r>
+    </w:p>
+    <w:p>
+      <w:pPr>
+        <w:numPr>
+          <w:ilvl w:val="1"/>
+          <w:numId w:val="15"/>
+        </w:numPr>
+        <w:rPr>
+          <w:color w:val="EE0000"/>
+        </w:rPr>
+      </w:pPr>
+      <w:r>
+        <w:rPr>
+          <w:color w:val="EE0000"/>
+        </w:rPr>
+        <w:t>In __getitem__, extract the corresponding logit: t_logit = self.teacher_logits[idx].</w:t>
+      </w:r>
+    </w:p>
+    <w:p>
+      <w:pPr>
+        <w:numPr>
+          <w:ilvl w:val="1"/>
+          <w:numId w:val="15"/>
+        </w:numPr>
+        <w:rPr>
+          <w:color w:val="EE0000"/>
+        </w:rPr>
+      </w:pPr>
+      <w:r>
+        <w:rPr>
+          <w:color w:val="EE0000"/>
+        </w:rPr>
+        <w:t>Return a 4-tuple: return (X, y, signer_id, t_logit).</w:t>
+      </w:r>
+    </w:p>
+    <w:p>
+      <w:pPr>
+        <w:numPr>
+          <w:ilvl w:val="0"/>
+          <w:numId w:val="15"/>
+        </w:numPr>
+        <w:rPr>
+          <w:color w:val="EE0000"/>
+        </w:rPr>
+      </w:pPr>
+      <w:r>
+        <w:rPr>
+          <w:b/>
+          <w:bCs/>
+          <w:color w:val="EE0000"/>
+        </w:rPr>
+        <w:t>Integration:</w:t>
+      </w:r>
+      <w:r>
+        <w:rPr>
+          <w:color w:val="EE0000"/>
+        </w:rPr>
+        <w:t xml:space="preserve"> Update your training loop signature in train_one_epoch to unpack this 4-tuple: for X, y, signer_ids, t_logits in bar:. </w:t>
+      </w:r>
+    </w:p>
+    <w:p>
+      <w:pPr>
+        <w:rPr>
+          <w:b/>
+          <w:bCs/>
+          <w:color w:val="EE0000"/>
+        </w:rPr>
+      </w:pPr>
+      <w:r>
+        <w:rPr>
+          <w:b/>
+          <w:bCs/>
+          <w:color w:val="EE0000"/>
+        </w:rPr>
+        <w:t>Phase 3: Add KL-Divergence (The Knowledge Distillation Loss)</w:t>
+      </w:r>
+    </w:p>
+    <w:p>
+      <w:pPr>
+        <w:rPr>
+          <w:color w:val="EE0000"/>
+        </w:rPr>
+      </w:pPr>
+      <w:r>
+        <w:rPr>
+          <w:color w:val="EE0000"/>
+        </w:rPr>
+        <w:t xml:space="preserve">You currently calculate loss = l_ce + LAMBDA_ADV * l_adv + ALPHA_SUPCON * l_supcon. You must inject the KD loss into this equation. </w:t>
+      </w:r>
+    </w:p>
+    <w:p>
+      <w:pPr>
+        <w:numPr>
+          <w:ilvl w:val="0"/>
+          <w:numId w:val="16"/>
+        </w:numPr>
+        <w:rPr>
+          <w:color w:val="EE0000"/>
+        </w:rPr>
+      </w:pPr>
+      <w:r>
+        <w:rPr>
+          <w:b/>
+          <w:bCs/>
+          <w:color w:val="EE0000"/>
+        </w:rPr>
+        <w:t>Action:</w:t>
+      </w:r>
+      <w:r>
+        <w:rPr>
+          <w:color w:val="EE0000"/>
+        </w:rPr>
+        <w:t xml:space="preserve"> Add the PyTorch KL-Divergence calculation inside train_one_epoch. </w:t>
+      </w:r>
+    </w:p>
+    <w:p>
+      <w:pPr>
+        <w:numPr>
+          <w:ilvl w:val="0"/>
+          <w:numId w:val="16"/>
+        </w:numPr>
+        <w:rPr>
+          <w:color w:val="EE0000"/>
+        </w:rPr>
+      </w:pPr>
+      <w:r>
+        <w:rPr>
+          <w:b/>
+          <w:bCs/>
+          <w:color w:val="EE0000"/>
+        </w:rPr>
+        <w:t>Logic to Code:</w:t>
+      </w:r>
+    </w:p>
+    <w:p>
+      <w:pPr>
+        <w:rPr>
+          <w:color w:val="EE0000"/>
+        </w:rPr>
+      </w:pPr>
+      <w:r>
+        <w:rPr>
+          <w:color w:val="EE0000"/>
+        </w:rPr>
+        <w:t>Python</w:t>
+      </w:r>
+    </w:p>
+    <w:p>
+      <w:pPr>
+        <w:rPr>
+          <w:color w:val="EE0000"/>
+        </w:rPr>
+      </w:pPr>
+      <w:r>
+        <w:rPr>
+          <w:color w:val="EE0000"/>
+        </w:rPr>
+        <w:t># Set Temperature (T) and KD Weight</w:t>
+      </w:r>
+    </w:p>
+    <w:p>
+      <w:pPr>
+        <w:rPr>
+          <w:color w:val="EE0000"/>
+        </w:rPr>
+      </w:pPr>
+      <w:r>
+        <w:rPr>
+          <w:color w:val="EE0000"/>
+        </w:rPr>
+        <w:t>T = 3.0</w:t>
+      </w:r>
+    </w:p>
+    <w:p>
+      <w:pPr>
+        <w:rPr>
+          <w:color w:val="EE0000"/>
+        </w:rPr>
+      </w:pPr>
+      <w:r>
+        <w:rPr>
+          <w:color w:val="EE0000"/>
+        </w:rPr>
+        <w:t xml:space="preserve">ALPHA_KD = 0.5 </w:t>
+      </w:r>
+    </w:p>
+    <w:p>
+      <w:pPr>
+        <w:rPr>
+          <w:color w:val="EE0000"/>
+        </w:rPr>
+      </w:pPr>
+    </w:p>
+    <w:p>
+      <w:pPr>
+        <w:rPr>
+          <w:color w:val="EE0000"/>
+        </w:rPr>
+      </w:pPr>
+      <w:r>
+        <w:rPr>
+          <w:color w:val="EE0000"/>
+        </w:rPr>
+        <w:t># Soften the student and teacher logits</w:t>
+      </w:r>
+    </w:p>
+    <w:p>
+      <w:pPr>
+        <w:rPr>
+          <w:color w:val="EE0000"/>
+        </w:rPr>
+      </w:pPr>
+      <w:r>
+        <w:rPr>
+          <w:color w:val="EE0000"/>
+        </w:rPr>
+        <w:t>student_log_probs = F.log_softmax(sign_logits / T, dim=1)</w:t>
+      </w:r>
+    </w:p>
+    <w:p>
+      <w:pPr>
+        <w:rPr>
+          <w:color w:val="EE0000"/>
+        </w:rPr>
+      </w:pPr>
+      <w:r>
+        <w:rPr>
+          <w:color w:val="EE0000"/>
+        </w:rPr>
+        <w:lastRenderedPageBreak/>
+        <w:t>teacher_probs = F.softmax(t_logits / T, dim=1)</w:t>
+      </w:r>
+    </w:p>
+    <w:p>
+      <w:pPr>
+        <w:rPr>
+          <w:color w:val="EE0000"/>
+        </w:rPr>
+      </w:pPr>
+    </w:p>
+    <w:p>
+      <w:pPr>
+        <w:rPr>
+          <w:color w:val="EE0000"/>
+        </w:rPr>
+      </w:pPr>
+      <w:r>
+        <w:rPr>
+          <w:color w:val="EE0000"/>
+        </w:rPr>
+        <w:t># Calculate KD Loss</w:t>
+      </w:r>
+    </w:p>
+    <w:p>
+      <w:pPr>
+        <w:rPr>
+          <w:color w:val="EE0000"/>
+        </w:rPr>
+      </w:pPr>
+      <w:r>
+        <w:rPr>
+          <w:color w:val="EE0000"/>
+        </w:rPr>
+        <w:t>l_kd = nn.KLDivLoss(reduction='batchmean')(student_log_probs, teacher_probs) * (T * T)</w:t>
+      </w:r>
+    </w:p>
+    <w:p>
+      <w:pPr>
+        <w:rPr>
+          <w:color w:val="EE0000"/>
+        </w:rPr>
+      </w:pPr>
+    </w:p>
+    <w:p>
+      <w:pPr>
+        <w:rPr>
+          <w:color w:val="EE0000"/>
+        </w:rPr>
+      </w:pPr>
+      <w:r>
+        <w:rPr>
+          <w:color w:val="EE0000"/>
+        </w:rPr>
+        <w:t># Update Total Loss Equation</w:t>
+      </w:r>
+    </w:p>
+    <w:p>
+      <w:pPr>
+        <w:rPr>
+          <w:color w:val="EE0000"/>
+        </w:rPr>
+      </w:pPr>
+      <w:r>
+        <w:rPr>
+          <w:color w:val="EE0000"/>
+        </w:rPr>
+        <w:t># Scale down standard CE loss to balance it with KD</w:t>
+      </w:r>
+    </w:p>
+    <w:p>
+      <w:pPr>
+        <w:rPr>
+          <w:color w:val="EE0000"/>
+        </w:rPr>
+      </w:pPr>
+      <w:r>
+        <w:rPr>
+          <w:color w:val="EE0000"/>
+        </w:rPr>
+        <w:t>loss = (0.5 * l_ce) + (ALPHA_KD * l_kd) + (LAMBDA_ADV * l_adv) + (ALPHA_SUPCON * l_</w:t>
+      </w:r>
+    </w:p>
+    <w:p>
+      <w:pPr>
+        <w:rPr>
+          <w:color w:val="EE0000"/>
+        </w:rPr>
+      </w:pPr>
+    </w:p>
     <w:sectPr>
       <w:pgSz w:w="12240" w:h="15840"/>
       <w:pgMar w:top="1440" w:right="1440" w:bottom="1440" w:left="1440" w:header="720" w:footer="720" w:gutter="0"/>
@@ -1730,6 +4136,2225 @@
 <file path=word/numbering.xml><?xml version="1.0" encoding="utf-8"?>
 <w:numbering xmlns:wpc="http://schemas.microsoft.com/office/word/2010/wordprocessingCanvas" xmlns:cx="http://schemas.microsoft.com/office/drawing/2014/chartex" xmlns:cx1="http://schemas.microsoft.com/office/drawing/2015/9/8/chartex" xmlns:cx2="http://schemas.microsoft.com/office/drawing/2015/10/21/chartex" xmlns:cx3="http://schemas.microsoft.com/office/drawing/2016/5/9/chartex" xmlns:cx4="http://schemas.microsoft.com/office/drawing/2016/5/10/chartex" xmlns:cx5="http://schemas.microsoft.com/office/drawing/2016/5/11/chartex" xmlns:cx6="http://schemas.microsoft.com/office/drawing/2016/5/12/chartex" xmlns:cx7="http://schemas.microsoft.com/office/drawing/2016/5/13/chartex" xmlns:cx8="http://schemas.microsoft.com/office/drawing/2016/5/14/chartex" xmlns:mc="http://schemas.openxmlformats.org/markup-compatibility/2006" xmlns:aink="http://schemas.microsoft.com/office/drawing/2016/ink" xmlns:am3d="http://schemas.microsoft.com/office/drawing/2017/model3d" xmlns:o="urn:schemas-microsoft-com:office:office" xmlns:oel="http://schemas.microsoft.com/office/2019/extlst" xmlns:r="http://schemas.openxmlformats.org/officeDocument/2006/relationships" xmlns:m="http://schemas.openxmlformats.org/officeDocument/2006/math" xmlns:v="urn:schemas-microsoft-com:vml" xmlns:wp14="http://schemas.microsoft.com/office/word/2010/wordprocessingDrawing" xmlns:wp="http://schemas.openxmlformats.org/drawingml/2006/wordprocessingDrawing" xmlns:w10="urn:schemas-microsoft-com:office:word" xmlns:w="http://schemas.openxmlformats.org/wordprocessingml/2006/main" xmlns:w14="http://schemas.microsoft.com/office/word/2010/wordml" xmlns:w15="http://schemas.microsoft.com/office/word/2012/wordml" xmlns:w16cex="http://schemas.microsoft.com/office/word/2018/wordml/cex" xmlns:w16cid="http://schemas.microsoft.com/office/word/2016/wordml/cid" xmlns:w16="http://schemas.microsoft.com/office/word/2018/wordml" xmlns:w16du="http://schemas.microsoft.com/office/word/2023/wordml/word16du" xmlns:w16sdtdh="http://schemas.microsoft.com/office/word/2020/wordml/sdtdatahash" xmlns:w16sdtfl="http://schemas.microsoft.com/office/word/2024/wordml/sdtformatlock" xmlns:w16se="http://schemas.microsoft.com/office/word/2015/wordml/symex" xmlns:wpg="http://schemas.microsoft.com/office/word/2010/wordprocessingGroup" xmlns:wpi="http://schemas.microsoft.com/office/word/2010/wordprocessingInk" xmlns:wne="http://schemas.microsoft.com/office/word/2006/wordml" xmlns:wps="http://schemas.microsoft.com/office/word/2010/wordprocessingShape" mc:Ignorable="w14 w15 w16se w16cid w16 w16cex w16sdtdh w16sdtfl w16du wp14">
   <w:abstractNum w:abstractNumId="0" w15:restartNumberingAfterBreak="0">
+    <w:nsid w:val="0B70039D"/>
+    <w:multiLevelType w:val="multilevel"/>
+    <w:tmpl w:val="A822939E"/>
+    <w:lvl w:ilvl="0">
+      <w:start w:val="1"/>
+      <w:numFmt w:val="bullet"/>
+      <w:lvlText w:val=""/>
+      <w:lvlJc w:val="left"/>
+      <w:pPr>
+        <w:tabs>
+          <w:tab w:val="num" w:pos="720"/>
+        </w:tabs>
+        <w:ind w:left="720" w:hanging="360"/>
+      </w:pPr>
+      <w:rPr>
+        <w:rFonts w:ascii="Symbol" w:hAnsi="Symbol" w:hint="default"/>
+        <w:sz w:val="20"/>
+      </w:rPr>
+    </w:lvl>
+    <w:lvl w:ilvl="1">
+      <w:start w:val="1"/>
+      <w:numFmt w:val="decimal"/>
+      <w:lvlText w:val="%2."/>
+      <w:lvlJc w:val="left"/>
+      <w:pPr>
+        <w:tabs>
+          <w:tab w:val="num" w:pos="1440"/>
+        </w:tabs>
+        <w:ind w:left="1440" w:hanging="360"/>
+      </w:pPr>
+    </w:lvl>
+    <w:lvl w:ilvl="2" w:tentative="1">
+      <w:start w:val="1"/>
+      <w:numFmt w:val="bullet"/>
+      <w:lvlText w:val=""/>
+      <w:lvlJc w:val="left"/>
+      <w:pPr>
+        <w:tabs>
+          <w:tab w:val="num" w:pos="2160"/>
+        </w:tabs>
+        <w:ind w:left="2160" w:hanging="360"/>
+      </w:pPr>
+      <w:rPr>
+        <w:rFonts w:ascii="Wingdings" w:hAnsi="Wingdings" w:hint="default"/>
+        <w:sz w:val="20"/>
+      </w:rPr>
+    </w:lvl>
+    <w:lvl w:ilvl="3" w:tentative="1">
+      <w:start w:val="1"/>
+      <w:numFmt w:val="bullet"/>
+      <w:lvlText w:val=""/>
+      <w:lvlJc w:val="left"/>
+      <w:pPr>
+        <w:tabs>
+          <w:tab w:val="num" w:pos="2880"/>
+        </w:tabs>
+        <w:ind w:left="2880" w:hanging="360"/>
+      </w:pPr>
+      <w:rPr>
+        <w:rFonts w:ascii="Wingdings" w:hAnsi="Wingdings" w:hint="default"/>
+        <w:sz w:val="20"/>
+      </w:rPr>
+    </w:lvl>
+    <w:lvl w:ilvl="4" w:tentative="1">
+      <w:start w:val="1"/>
+      <w:numFmt w:val="bullet"/>
+      <w:lvlText w:val=""/>
+      <w:lvlJc w:val="left"/>
+      <w:pPr>
+        <w:tabs>
+          <w:tab w:val="num" w:pos="3600"/>
+        </w:tabs>
+        <w:ind w:left="3600" w:hanging="360"/>
+      </w:pPr>
+      <w:rPr>
+        <w:rFonts w:ascii="Wingdings" w:hAnsi="Wingdings" w:hint="default"/>
+        <w:sz w:val="20"/>
+      </w:rPr>
+    </w:lvl>
+    <w:lvl w:ilvl="5" w:tentative="1">
+      <w:start w:val="1"/>
+      <w:numFmt w:val="bullet"/>
+      <w:lvlText w:val=""/>
+      <w:lvlJc w:val="left"/>
+      <w:pPr>
+        <w:tabs>
+          <w:tab w:val="num" w:pos="4320"/>
+        </w:tabs>
+        <w:ind w:left="4320" w:hanging="360"/>
+      </w:pPr>
+      <w:rPr>
+        <w:rFonts w:ascii="Wingdings" w:hAnsi="Wingdings" w:hint="default"/>
+        <w:sz w:val="20"/>
+      </w:rPr>
+    </w:lvl>
+    <w:lvl w:ilvl="6" w:tentative="1">
+      <w:start w:val="1"/>
+      <w:numFmt w:val="bullet"/>
+      <w:lvlText w:val=""/>
+      <w:lvlJc w:val="left"/>
+      <w:pPr>
+        <w:tabs>
+          <w:tab w:val="num" w:pos="5040"/>
+        </w:tabs>
+        <w:ind w:left="5040" w:hanging="360"/>
+      </w:pPr>
+      <w:rPr>
+        <w:rFonts w:ascii="Wingdings" w:hAnsi="Wingdings" w:hint="default"/>
+        <w:sz w:val="20"/>
+      </w:rPr>
+    </w:lvl>
+    <w:lvl w:ilvl="7" w:tentative="1">
+      <w:start w:val="1"/>
+      <w:numFmt w:val="bullet"/>
+      <w:lvlText w:val=""/>
+      <w:lvlJc w:val="left"/>
+      <w:pPr>
+        <w:tabs>
+          <w:tab w:val="num" w:pos="5760"/>
+        </w:tabs>
+        <w:ind w:left="5760" w:hanging="360"/>
+      </w:pPr>
+      <w:rPr>
+        <w:rFonts w:ascii="Wingdings" w:hAnsi="Wingdings" w:hint="default"/>
+        <w:sz w:val="20"/>
+      </w:rPr>
+    </w:lvl>
+    <w:lvl w:ilvl="8" w:tentative="1">
+      <w:start w:val="1"/>
+      <w:numFmt w:val="bullet"/>
+      <w:lvlText w:val=""/>
+      <w:lvlJc w:val="left"/>
+      <w:pPr>
+        <w:tabs>
+          <w:tab w:val="num" w:pos="6480"/>
+        </w:tabs>
+        <w:ind w:left="6480" w:hanging="360"/>
+      </w:pPr>
+      <w:rPr>
+        <w:rFonts w:ascii="Wingdings" w:hAnsi="Wingdings" w:hint="default"/>
+        <w:sz w:val="20"/>
+      </w:rPr>
+    </w:lvl>
+  </w:abstractNum>
+  <w:abstractNum w:abstractNumId="1" w15:restartNumberingAfterBreak="0">
+    <w:nsid w:val="24BB4F7D"/>
+    <w:multiLevelType w:val="multilevel"/>
+    <w:tmpl w:val="5B0E96B8"/>
+    <w:lvl w:ilvl="0">
+      <w:start w:val="1"/>
+      <w:numFmt w:val="bullet"/>
+      <w:lvlText w:val=""/>
+      <w:lvlJc w:val="left"/>
+      <w:pPr>
+        <w:tabs>
+          <w:tab w:val="num" w:pos="720"/>
+        </w:tabs>
+        <w:ind w:left="720" w:hanging="360"/>
+      </w:pPr>
+      <w:rPr>
+        <w:rFonts w:ascii="Symbol" w:hAnsi="Symbol" w:hint="default"/>
+        <w:sz w:val="20"/>
+      </w:rPr>
+    </w:lvl>
+    <w:lvl w:ilvl="1" w:tentative="1">
+      <w:start w:val="1"/>
+      <w:numFmt w:val="bullet"/>
+      <w:lvlText w:val="o"/>
+      <w:lvlJc w:val="left"/>
+      <w:pPr>
+        <w:tabs>
+          <w:tab w:val="num" w:pos="1440"/>
+        </w:tabs>
+        <w:ind w:left="1440" w:hanging="360"/>
+      </w:pPr>
+      <w:rPr>
+        <w:rFonts w:ascii="Courier New" w:hAnsi="Courier New" w:hint="default"/>
+        <w:sz w:val="20"/>
+      </w:rPr>
+    </w:lvl>
+    <w:lvl w:ilvl="2" w:tentative="1">
+      <w:start w:val="1"/>
+      <w:numFmt w:val="bullet"/>
+      <w:lvlText w:val=""/>
+      <w:lvlJc w:val="left"/>
+      <w:pPr>
+        <w:tabs>
+          <w:tab w:val="num" w:pos="2160"/>
+        </w:tabs>
+        <w:ind w:left="2160" w:hanging="360"/>
+      </w:pPr>
+      <w:rPr>
+        <w:rFonts w:ascii="Wingdings" w:hAnsi="Wingdings" w:hint="default"/>
+        <w:sz w:val="20"/>
+      </w:rPr>
+    </w:lvl>
+    <w:lvl w:ilvl="3" w:tentative="1">
+      <w:start w:val="1"/>
+      <w:numFmt w:val="bullet"/>
+      <w:lvlText w:val=""/>
+      <w:lvlJc w:val="left"/>
+      <w:pPr>
+        <w:tabs>
+          <w:tab w:val="num" w:pos="2880"/>
+        </w:tabs>
+        <w:ind w:left="2880" w:hanging="360"/>
+      </w:pPr>
+      <w:rPr>
+        <w:rFonts w:ascii="Wingdings" w:hAnsi="Wingdings" w:hint="default"/>
+        <w:sz w:val="20"/>
+      </w:rPr>
+    </w:lvl>
+    <w:lvl w:ilvl="4" w:tentative="1">
+      <w:start w:val="1"/>
+      <w:numFmt w:val="bullet"/>
+      <w:lvlText w:val=""/>
+      <w:lvlJc w:val="left"/>
+      <w:pPr>
+        <w:tabs>
+          <w:tab w:val="num" w:pos="3600"/>
+        </w:tabs>
+        <w:ind w:left="3600" w:hanging="360"/>
+      </w:pPr>
+      <w:rPr>
+        <w:rFonts w:ascii="Wingdings" w:hAnsi="Wingdings" w:hint="default"/>
+        <w:sz w:val="20"/>
+      </w:rPr>
+    </w:lvl>
+    <w:lvl w:ilvl="5" w:tentative="1">
+      <w:start w:val="1"/>
+      <w:numFmt w:val="bullet"/>
+      <w:lvlText w:val=""/>
+      <w:lvlJc w:val="left"/>
+      <w:pPr>
+        <w:tabs>
+          <w:tab w:val="num" w:pos="4320"/>
+        </w:tabs>
+        <w:ind w:left="4320" w:hanging="360"/>
+      </w:pPr>
+      <w:rPr>
+        <w:rFonts w:ascii="Wingdings" w:hAnsi="Wingdings" w:hint="default"/>
+        <w:sz w:val="20"/>
+      </w:rPr>
+    </w:lvl>
+    <w:lvl w:ilvl="6" w:tentative="1">
+      <w:start w:val="1"/>
+      <w:numFmt w:val="bullet"/>
+      <w:lvlText w:val=""/>
+      <w:lvlJc w:val="left"/>
+      <w:pPr>
+        <w:tabs>
+          <w:tab w:val="num" w:pos="5040"/>
+        </w:tabs>
+        <w:ind w:left="5040" w:hanging="360"/>
+      </w:pPr>
+      <w:rPr>
+        <w:rFonts w:ascii="Wingdings" w:hAnsi="Wingdings" w:hint="default"/>
+        <w:sz w:val="20"/>
+      </w:rPr>
+    </w:lvl>
+    <w:lvl w:ilvl="7" w:tentative="1">
+      <w:start w:val="1"/>
+      <w:numFmt w:val="bullet"/>
+      <w:lvlText w:val=""/>
+      <w:lvlJc w:val="left"/>
+      <w:pPr>
+        <w:tabs>
+          <w:tab w:val="num" w:pos="5760"/>
+        </w:tabs>
+        <w:ind w:left="5760" w:hanging="360"/>
+      </w:pPr>
+      <w:rPr>
+        <w:rFonts w:ascii="Wingdings" w:hAnsi="Wingdings" w:hint="default"/>
+        <w:sz w:val="20"/>
+      </w:rPr>
+    </w:lvl>
+    <w:lvl w:ilvl="8" w:tentative="1">
+      <w:start w:val="1"/>
+      <w:numFmt w:val="bullet"/>
+      <w:lvlText w:val=""/>
+      <w:lvlJc w:val="left"/>
+      <w:pPr>
+        <w:tabs>
+          <w:tab w:val="num" w:pos="6480"/>
+        </w:tabs>
+        <w:ind w:left="6480" w:hanging="360"/>
+      </w:pPr>
+      <w:rPr>
+        <w:rFonts w:ascii="Wingdings" w:hAnsi="Wingdings" w:hint="default"/>
+        <w:sz w:val="20"/>
+      </w:rPr>
+    </w:lvl>
+  </w:abstractNum>
+  <w:abstractNum w:abstractNumId="2" w15:restartNumberingAfterBreak="0">
+    <w:nsid w:val="2B103BB6"/>
+    <w:multiLevelType w:val="multilevel"/>
+    <w:tmpl w:val="FDCAB258"/>
+    <w:lvl w:ilvl="0">
+      <w:start w:val="1"/>
+      <w:numFmt w:val="bullet"/>
+      <w:lvlText w:val=""/>
+      <w:lvlJc w:val="left"/>
+      <w:pPr>
+        <w:tabs>
+          <w:tab w:val="num" w:pos="720"/>
+        </w:tabs>
+        <w:ind w:left="720" w:hanging="360"/>
+      </w:pPr>
+      <w:rPr>
+        <w:rFonts w:ascii="Symbol" w:hAnsi="Symbol" w:hint="default"/>
+        <w:sz w:val="20"/>
+      </w:rPr>
+    </w:lvl>
+    <w:lvl w:ilvl="1">
+      <w:start w:val="1"/>
+      <w:numFmt w:val="decimal"/>
+      <w:lvlText w:val="%2."/>
+      <w:lvlJc w:val="left"/>
+      <w:pPr>
+        <w:tabs>
+          <w:tab w:val="num" w:pos="1440"/>
+        </w:tabs>
+        <w:ind w:left="1440" w:hanging="360"/>
+      </w:pPr>
+    </w:lvl>
+    <w:lvl w:ilvl="2" w:tentative="1">
+      <w:start w:val="1"/>
+      <w:numFmt w:val="bullet"/>
+      <w:lvlText w:val=""/>
+      <w:lvlJc w:val="left"/>
+      <w:pPr>
+        <w:tabs>
+          <w:tab w:val="num" w:pos="2160"/>
+        </w:tabs>
+        <w:ind w:left="2160" w:hanging="360"/>
+      </w:pPr>
+      <w:rPr>
+        <w:rFonts w:ascii="Wingdings" w:hAnsi="Wingdings" w:hint="default"/>
+        <w:sz w:val="20"/>
+      </w:rPr>
+    </w:lvl>
+    <w:lvl w:ilvl="3" w:tentative="1">
+      <w:start w:val="1"/>
+      <w:numFmt w:val="bullet"/>
+      <w:lvlText w:val=""/>
+      <w:lvlJc w:val="left"/>
+      <w:pPr>
+        <w:tabs>
+          <w:tab w:val="num" w:pos="2880"/>
+        </w:tabs>
+        <w:ind w:left="2880" w:hanging="360"/>
+      </w:pPr>
+      <w:rPr>
+        <w:rFonts w:ascii="Wingdings" w:hAnsi="Wingdings" w:hint="default"/>
+        <w:sz w:val="20"/>
+      </w:rPr>
+    </w:lvl>
+    <w:lvl w:ilvl="4" w:tentative="1">
+      <w:start w:val="1"/>
+      <w:numFmt w:val="bullet"/>
+      <w:lvlText w:val=""/>
+      <w:lvlJc w:val="left"/>
+      <w:pPr>
+        <w:tabs>
+          <w:tab w:val="num" w:pos="3600"/>
+        </w:tabs>
+        <w:ind w:left="3600" w:hanging="360"/>
+      </w:pPr>
+      <w:rPr>
+        <w:rFonts w:ascii="Wingdings" w:hAnsi="Wingdings" w:hint="default"/>
+        <w:sz w:val="20"/>
+      </w:rPr>
+    </w:lvl>
+    <w:lvl w:ilvl="5" w:tentative="1">
+      <w:start w:val="1"/>
+      <w:numFmt w:val="bullet"/>
+      <w:lvlText w:val=""/>
+      <w:lvlJc w:val="left"/>
+      <w:pPr>
+        <w:tabs>
+          <w:tab w:val="num" w:pos="4320"/>
+        </w:tabs>
+        <w:ind w:left="4320" w:hanging="360"/>
+      </w:pPr>
+      <w:rPr>
+        <w:rFonts w:ascii="Wingdings" w:hAnsi="Wingdings" w:hint="default"/>
+        <w:sz w:val="20"/>
+      </w:rPr>
+    </w:lvl>
+    <w:lvl w:ilvl="6" w:tentative="1">
+      <w:start w:val="1"/>
+      <w:numFmt w:val="bullet"/>
+      <w:lvlText w:val=""/>
+      <w:lvlJc w:val="left"/>
+      <w:pPr>
+        <w:tabs>
+          <w:tab w:val="num" w:pos="5040"/>
+        </w:tabs>
+        <w:ind w:left="5040" w:hanging="360"/>
+      </w:pPr>
+      <w:rPr>
+        <w:rFonts w:ascii="Wingdings" w:hAnsi="Wingdings" w:hint="default"/>
+        <w:sz w:val="20"/>
+      </w:rPr>
+    </w:lvl>
+    <w:lvl w:ilvl="7" w:tentative="1">
+      <w:start w:val="1"/>
+      <w:numFmt w:val="bullet"/>
+      <w:lvlText w:val=""/>
+      <w:lvlJc w:val="left"/>
+      <w:pPr>
+        <w:tabs>
+          <w:tab w:val="num" w:pos="5760"/>
+        </w:tabs>
+        <w:ind w:left="5760" w:hanging="360"/>
+      </w:pPr>
+      <w:rPr>
+        <w:rFonts w:ascii="Wingdings" w:hAnsi="Wingdings" w:hint="default"/>
+        <w:sz w:val="20"/>
+      </w:rPr>
+    </w:lvl>
+    <w:lvl w:ilvl="8" w:tentative="1">
+      <w:start w:val="1"/>
+      <w:numFmt w:val="bullet"/>
+      <w:lvlText w:val=""/>
+      <w:lvlJc w:val="left"/>
+      <w:pPr>
+        <w:tabs>
+          <w:tab w:val="num" w:pos="6480"/>
+        </w:tabs>
+        <w:ind w:left="6480" w:hanging="360"/>
+      </w:pPr>
+      <w:rPr>
+        <w:rFonts w:ascii="Wingdings" w:hAnsi="Wingdings" w:hint="default"/>
+        <w:sz w:val="20"/>
+      </w:rPr>
+    </w:lvl>
+  </w:abstractNum>
+  <w:abstractNum w:abstractNumId="3" w15:restartNumberingAfterBreak="0">
+    <w:nsid w:val="2EB22B75"/>
+    <w:multiLevelType w:val="multilevel"/>
+    <w:tmpl w:val="D80CD7D0"/>
+    <w:lvl w:ilvl="0">
+      <w:start w:val="1"/>
+      <w:numFmt w:val="bullet"/>
+      <w:lvlText w:val=""/>
+      <w:lvlJc w:val="left"/>
+      <w:pPr>
+        <w:tabs>
+          <w:tab w:val="num" w:pos="720"/>
+        </w:tabs>
+        <w:ind w:left="720" w:hanging="360"/>
+      </w:pPr>
+      <w:rPr>
+        <w:rFonts w:ascii="Symbol" w:hAnsi="Symbol" w:hint="default"/>
+        <w:sz w:val="20"/>
+      </w:rPr>
+    </w:lvl>
+    <w:lvl w:ilvl="1" w:tentative="1">
+      <w:start w:val="1"/>
+      <w:numFmt w:val="bullet"/>
+      <w:lvlText w:val="o"/>
+      <w:lvlJc w:val="left"/>
+      <w:pPr>
+        <w:tabs>
+          <w:tab w:val="num" w:pos="1440"/>
+        </w:tabs>
+        <w:ind w:left="1440" w:hanging="360"/>
+      </w:pPr>
+      <w:rPr>
+        <w:rFonts w:ascii="Courier New" w:hAnsi="Courier New" w:hint="default"/>
+        <w:sz w:val="20"/>
+      </w:rPr>
+    </w:lvl>
+    <w:lvl w:ilvl="2" w:tentative="1">
+      <w:start w:val="1"/>
+      <w:numFmt w:val="bullet"/>
+      <w:lvlText w:val=""/>
+      <w:lvlJc w:val="left"/>
+      <w:pPr>
+        <w:tabs>
+          <w:tab w:val="num" w:pos="2160"/>
+        </w:tabs>
+        <w:ind w:left="2160" w:hanging="360"/>
+      </w:pPr>
+      <w:rPr>
+        <w:rFonts w:ascii="Wingdings" w:hAnsi="Wingdings" w:hint="default"/>
+        <w:sz w:val="20"/>
+      </w:rPr>
+    </w:lvl>
+    <w:lvl w:ilvl="3" w:tentative="1">
+      <w:start w:val="1"/>
+      <w:numFmt w:val="bullet"/>
+      <w:lvlText w:val=""/>
+      <w:lvlJc w:val="left"/>
+      <w:pPr>
+        <w:tabs>
+          <w:tab w:val="num" w:pos="2880"/>
+        </w:tabs>
+        <w:ind w:left="2880" w:hanging="360"/>
+      </w:pPr>
+      <w:rPr>
+        <w:rFonts w:ascii="Wingdings" w:hAnsi="Wingdings" w:hint="default"/>
+        <w:sz w:val="20"/>
+      </w:rPr>
+    </w:lvl>
+    <w:lvl w:ilvl="4" w:tentative="1">
+      <w:start w:val="1"/>
+      <w:numFmt w:val="bullet"/>
+      <w:lvlText w:val=""/>
+      <w:lvlJc w:val="left"/>
+      <w:pPr>
+        <w:tabs>
+          <w:tab w:val="num" w:pos="3600"/>
+        </w:tabs>
+        <w:ind w:left="3600" w:hanging="360"/>
+      </w:pPr>
+      <w:rPr>
+        <w:rFonts w:ascii="Wingdings" w:hAnsi="Wingdings" w:hint="default"/>
+        <w:sz w:val="20"/>
+      </w:rPr>
+    </w:lvl>
+    <w:lvl w:ilvl="5" w:tentative="1">
+      <w:start w:val="1"/>
+      <w:numFmt w:val="bullet"/>
+      <w:lvlText w:val=""/>
+      <w:lvlJc w:val="left"/>
+      <w:pPr>
+        <w:tabs>
+          <w:tab w:val="num" w:pos="4320"/>
+        </w:tabs>
+        <w:ind w:left="4320" w:hanging="360"/>
+      </w:pPr>
+      <w:rPr>
+        <w:rFonts w:ascii="Wingdings" w:hAnsi="Wingdings" w:hint="default"/>
+        <w:sz w:val="20"/>
+      </w:rPr>
+    </w:lvl>
+    <w:lvl w:ilvl="6" w:tentative="1">
+      <w:start w:val="1"/>
+      <w:numFmt w:val="bullet"/>
+      <w:lvlText w:val=""/>
+      <w:lvlJc w:val="left"/>
+      <w:pPr>
+        <w:tabs>
+          <w:tab w:val="num" w:pos="5040"/>
+        </w:tabs>
+        <w:ind w:left="5040" w:hanging="360"/>
+      </w:pPr>
+      <w:rPr>
+        <w:rFonts w:ascii="Wingdings" w:hAnsi="Wingdings" w:hint="default"/>
+        <w:sz w:val="20"/>
+      </w:rPr>
+    </w:lvl>
+    <w:lvl w:ilvl="7" w:tentative="1">
+      <w:start w:val="1"/>
+      <w:numFmt w:val="bullet"/>
+      <w:lvlText w:val=""/>
+      <w:lvlJc w:val="left"/>
+      <w:pPr>
+        <w:tabs>
+          <w:tab w:val="num" w:pos="5760"/>
+        </w:tabs>
+        <w:ind w:left="5760" w:hanging="360"/>
+      </w:pPr>
+      <w:rPr>
+        <w:rFonts w:ascii="Wingdings" w:hAnsi="Wingdings" w:hint="default"/>
+        <w:sz w:val="20"/>
+      </w:rPr>
+    </w:lvl>
+    <w:lvl w:ilvl="8" w:tentative="1">
+      <w:start w:val="1"/>
+      <w:numFmt w:val="bullet"/>
+      <w:lvlText w:val=""/>
+      <w:lvlJc w:val="left"/>
+      <w:pPr>
+        <w:tabs>
+          <w:tab w:val="num" w:pos="6480"/>
+        </w:tabs>
+        <w:ind w:left="6480" w:hanging="360"/>
+      </w:pPr>
+      <w:rPr>
+        <w:rFonts w:ascii="Wingdings" w:hAnsi="Wingdings" w:hint="default"/>
+        <w:sz w:val="20"/>
+      </w:rPr>
+    </w:lvl>
+  </w:abstractNum>
+  <w:abstractNum w:abstractNumId="4" w15:restartNumberingAfterBreak="0">
+    <w:nsid w:val="35275E47"/>
+    <w:multiLevelType w:val="multilevel"/>
+    <w:tmpl w:val="C0A2C092"/>
+    <w:lvl w:ilvl="0">
+      <w:start w:val="1"/>
+      <w:numFmt w:val="bullet"/>
+      <w:lvlText w:val=""/>
+      <w:lvlJc w:val="left"/>
+      <w:pPr>
+        <w:tabs>
+          <w:tab w:val="num" w:pos="720"/>
+        </w:tabs>
+        <w:ind w:left="720" w:hanging="360"/>
+      </w:pPr>
+      <w:rPr>
+        <w:rFonts w:ascii="Symbol" w:hAnsi="Symbol" w:hint="default"/>
+        <w:sz w:val="20"/>
+      </w:rPr>
+    </w:lvl>
+    <w:lvl w:ilvl="1">
+      <w:start w:val="1"/>
+      <w:numFmt w:val="decimal"/>
+      <w:lvlText w:val="%2."/>
+      <w:lvlJc w:val="left"/>
+      <w:pPr>
+        <w:ind w:left="1440" w:hanging="360"/>
+      </w:pPr>
+      <w:rPr>
+        <w:rFonts w:hint="default"/>
+      </w:rPr>
+    </w:lvl>
+    <w:lvl w:ilvl="2" w:tentative="1">
+      <w:start w:val="1"/>
+      <w:numFmt w:val="bullet"/>
+      <w:lvlText w:val=""/>
+      <w:lvlJc w:val="left"/>
+      <w:pPr>
+        <w:tabs>
+          <w:tab w:val="num" w:pos="2160"/>
+        </w:tabs>
+        <w:ind w:left="2160" w:hanging="360"/>
+      </w:pPr>
+      <w:rPr>
+        <w:rFonts w:ascii="Wingdings" w:hAnsi="Wingdings" w:hint="default"/>
+        <w:sz w:val="20"/>
+      </w:rPr>
+    </w:lvl>
+    <w:lvl w:ilvl="3" w:tentative="1">
+      <w:start w:val="1"/>
+      <w:numFmt w:val="bullet"/>
+      <w:lvlText w:val=""/>
+      <w:lvlJc w:val="left"/>
+      <w:pPr>
+        <w:tabs>
+          <w:tab w:val="num" w:pos="2880"/>
+        </w:tabs>
+        <w:ind w:left="2880" w:hanging="360"/>
+      </w:pPr>
+      <w:rPr>
+        <w:rFonts w:ascii="Wingdings" w:hAnsi="Wingdings" w:hint="default"/>
+        <w:sz w:val="20"/>
+      </w:rPr>
+    </w:lvl>
+    <w:lvl w:ilvl="4" w:tentative="1">
+      <w:start w:val="1"/>
+      <w:numFmt w:val="bullet"/>
+      <w:lvlText w:val=""/>
+      <w:lvlJc w:val="left"/>
+      <w:pPr>
+        <w:tabs>
+          <w:tab w:val="num" w:pos="3600"/>
+        </w:tabs>
+        <w:ind w:left="3600" w:hanging="360"/>
+      </w:pPr>
+      <w:rPr>
+        <w:rFonts w:ascii="Wingdings" w:hAnsi="Wingdings" w:hint="default"/>
+        <w:sz w:val="20"/>
+      </w:rPr>
+    </w:lvl>
+    <w:lvl w:ilvl="5" w:tentative="1">
+      <w:start w:val="1"/>
+      <w:numFmt w:val="bullet"/>
+      <w:lvlText w:val=""/>
+      <w:lvlJc w:val="left"/>
+      <w:pPr>
+        <w:tabs>
+          <w:tab w:val="num" w:pos="4320"/>
+        </w:tabs>
+        <w:ind w:left="4320" w:hanging="360"/>
+      </w:pPr>
+      <w:rPr>
+        <w:rFonts w:ascii="Wingdings" w:hAnsi="Wingdings" w:hint="default"/>
+        <w:sz w:val="20"/>
+      </w:rPr>
+    </w:lvl>
+    <w:lvl w:ilvl="6" w:tentative="1">
+      <w:start w:val="1"/>
+      <w:numFmt w:val="bullet"/>
+      <w:lvlText w:val=""/>
+      <w:lvlJc w:val="left"/>
+      <w:pPr>
+        <w:tabs>
+          <w:tab w:val="num" w:pos="5040"/>
+        </w:tabs>
+        <w:ind w:left="5040" w:hanging="360"/>
+      </w:pPr>
+      <w:rPr>
+        <w:rFonts w:ascii="Wingdings" w:hAnsi="Wingdings" w:hint="default"/>
+        <w:sz w:val="20"/>
+      </w:rPr>
+    </w:lvl>
+    <w:lvl w:ilvl="7" w:tentative="1">
+      <w:start w:val="1"/>
+      <w:numFmt w:val="bullet"/>
+      <w:lvlText w:val=""/>
+      <w:lvlJc w:val="left"/>
+      <w:pPr>
+        <w:tabs>
+          <w:tab w:val="num" w:pos="5760"/>
+        </w:tabs>
+        <w:ind w:left="5760" w:hanging="360"/>
+      </w:pPr>
+      <w:rPr>
+        <w:rFonts w:ascii="Wingdings" w:hAnsi="Wingdings" w:hint="default"/>
+        <w:sz w:val="20"/>
+      </w:rPr>
+    </w:lvl>
+    <w:lvl w:ilvl="8" w:tentative="1">
+      <w:start w:val="1"/>
+      <w:numFmt w:val="bullet"/>
+      <w:lvlText w:val=""/>
+      <w:lvlJc w:val="left"/>
+      <w:pPr>
+        <w:tabs>
+          <w:tab w:val="num" w:pos="6480"/>
+        </w:tabs>
+        <w:ind w:left="6480" w:hanging="360"/>
+      </w:pPr>
+      <w:rPr>
+        <w:rFonts w:ascii="Wingdings" w:hAnsi="Wingdings" w:hint="default"/>
+        <w:sz w:val="20"/>
+      </w:rPr>
+    </w:lvl>
+  </w:abstractNum>
+  <w:abstractNum w:abstractNumId="5" w15:restartNumberingAfterBreak="0">
+    <w:nsid w:val="391F1057"/>
+    <w:multiLevelType w:val="multilevel"/>
+    <w:tmpl w:val="071CF5A4"/>
+    <w:lvl w:ilvl="0">
+      <w:start w:val="1"/>
+      <w:numFmt w:val="bullet"/>
+      <w:lvlText w:val=""/>
+      <w:lvlJc w:val="left"/>
+      <w:pPr>
+        <w:tabs>
+          <w:tab w:val="num" w:pos="720"/>
+        </w:tabs>
+        <w:ind w:left="720" w:hanging="360"/>
+      </w:pPr>
+      <w:rPr>
+        <w:rFonts w:ascii="Symbol" w:hAnsi="Symbol" w:hint="default"/>
+        <w:sz w:val="20"/>
+      </w:rPr>
+    </w:lvl>
+    <w:lvl w:ilvl="1" w:tentative="1">
+      <w:start w:val="1"/>
+      <w:numFmt w:val="bullet"/>
+      <w:lvlText w:val="o"/>
+      <w:lvlJc w:val="left"/>
+      <w:pPr>
+        <w:tabs>
+          <w:tab w:val="num" w:pos="1440"/>
+        </w:tabs>
+        <w:ind w:left="1440" w:hanging="360"/>
+      </w:pPr>
+      <w:rPr>
+        <w:rFonts w:ascii="Courier New" w:hAnsi="Courier New" w:hint="default"/>
+        <w:sz w:val="20"/>
+      </w:rPr>
+    </w:lvl>
+    <w:lvl w:ilvl="2" w:tentative="1">
+      <w:start w:val="1"/>
+      <w:numFmt w:val="bullet"/>
+      <w:lvlText w:val=""/>
+      <w:lvlJc w:val="left"/>
+      <w:pPr>
+        <w:tabs>
+          <w:tab w:val="num" w:pos="2160"/>
+        </w:tabs>
+        <w:ind w:left="2160" w:hanging="360"/>
+      </w:pPr>
+      <w:rPr>
+        <w:rFonts w:ascii="Wingdings" w:hAnsi="Wingdings" w:hint="default"/>
+        <w:sz w:val="20"/>
+      </w:rPr>
+    </w:lvl>
+    <w:lvl w:ilvl="3" w:tentative="1">
+      <w:start w:val="1"/>
+      <w:numFmt w:val="bullet"/>
+      <w:lvlText w:val=""/>
+      <w:lvlJc w:val="left"/>
+      <w:pPr>
+        <w:tabs>
+          <w:tab w:val="num" w:pos="2880"/>
+        </w:tabs>
+        <w:ind w:left="2880" w:hanging="360"/>
+      </w:pPr>
+      <w:rPr>
+        <w:rFonts w:ascii="Wingdings" w:hAnsi="Wingdings" w:hint="default"/>
+        <w:sz w:val="20"/>
+      </w:rPr>
+    </w:lvl>
+    <w:lvl w:ilvl="4" w:tentative="1">
+      <w:start w:val="1"/>
+      <w:numFmt w:val="bullet"/>
+      <w:lvlText w:val=""/>
+      <w:lvlJc w:val="left"/>
+      <w:pPr>
+        <w:tabs>
+          <w:tab w:val="num" w:pos="3600"/>
+        </w:tabs>
+        <w:ind w:left="3600" w:hanging="360"/>
+      </w:pPr>
+      <w:rPr>
+        <w:rFonts w:ascii="Wingdings" w:hAnsi="Wingdings" w:hint="default"/>
+        <w:sz w:val="20"/>
+      </w:rPr>
+    </w:lvl>
+    <w:lvl w:ilvl="5" w:tentative="1">
+      <w:start w:val="1"/>
+      <w:numFmt w:val="bullet"/>
+      <w:lvlText w:val=""/>
+      <w:lvlJc w:val="left"/>
+      <w:pPr>
+        <w:tabs>
+          <w:tab w:val="num" w:pos="4320"/>
+        </w:tabs>
+        <w:ind w:left="4320" w:hanging="360"/>
+      </w:pPr>
+      <w:rPr>
+        <w:rFonts w:ascii="Wingdings" w:hAnsi="Wingdings" w:hint="default"/>
+        <w:sz w:val="20"/>
+      </w:rPr>
+    </w:lvl>
+    <w:lvl w:ilvl="6" w:tentative="1">
+      <w:start w:val="1"/>
+      <w:numFmt w:val="bullet"/>
+      <w:lvlText w:val=""/>
+      <w:lvlJc w:val="left"/>
+      <w:pPr>
+        <w:tabs>
+          <w:tab w:val="num" w:pos="5040"/>
+        </w:tabs>
+        <w:ind w:left="5040" w:hanging="360"/>
+      </w:pPr>
+      <w:rPr>
+        <w:rFonts w:ascii="Wingdings" w:hAnsi="Wingdings" w:hint="default"/>
+        <w:sz w:val="20"/>
+      </w:rPr>
+    </w:lvl>
+    <w:lvl w:ilvl="7" w:tentative="1">
+      <w:start w:val="1"/>
+      <w:numFmt w:val="bullet"/>
+      <w:lvlText w:val=""/>
+      <w:lvlJc w:val="left"/>
+      <w:pPr>
+        <w:tabs>
+          <w:tab w:val="num" w:pos="5760"/>
+        </w:tabs>
+        <w:ind w:left="5760" w:hanging="360"/>
+      </w:pPr>
+      <w:rPr>
+        <w:rFonts w:ascii="Wingdings" w:hAnsi="Wingdings" w:hint="default"/>
+        <w:sz w:val="20"/>
+      </w:rPr>
+    </w:lvl>
+    <w:lvl w:ilvl="8" w:tentative="1">
+      <w:start w:val="1"/>
+      <w:numFmt w:val="bullet"/>
+      <w:lvlText w:val=""/>
+      <w:lvlJc w:val="left"/>
+      <w:pPr>
+        <w:tabs>
+          <w:tab w:val="num" w:pos="6480"/>
+        </w:tabs>
+        <w:ind w:left="6480" w:hanging="360"/>
+      </w:pPr>
+      <w:rPr>
+        <w:rFonts w:ascii="Wingdings" w:hAnsi="Wingdings" w:hint="default"/>
+        <w:sz w:val="20"/>
+      </w:rPr>
+    </w:lvl>
+  </w:abstractNum>
+  <w:abstractNum w:abstractNumId="6" w15:restartNumberingAfterBreak="0">
+    <w:nsid w:val="47380016"/>
+    <w:multiLevelType w:val="multilevel"/>
+    <w:tmpl w:val="E01C0D74"/>
+    <w:lvl w:ilvl="0">
+      <w:start w:val="1"/>
+      <w:numFmt w:val="bullet"/>
+      <w:lvlText w:val=""/>
+      <w:lvlJc w:val="left"/>
+      <w:pPr>
+        <w:tabs>
+          <w:tab w:val="num" w:pos="720"/>
+        </w:tabs>
+        <w:ind w:left="720" w:hanging="360"/>
+      </w:pPr>
+      <w:rPr>
+        <w:rFonts w:ascii="Symbol" w:hAnsi="Symbol" w:hint="default"/>
+        <w:sz w:val="20"/>
+      </w:rPr>
+    </w:lvl>
+    <w:lvl w:ilvl="1" w:tentative="1">
+      <w:start w:val="1"/>
+      <w:numFmt w:val="bullet"/>
+      <w:lvlText w:val="o"/>
+      <w:lvlJc w:val="left"/>
+      <w:pPr>
+        <w:tabs>
+          <w:tab w:val="num" w:pos="1440"/>
+        </w:tabs>
+        <w:ind w:left="1440" w:hanging="360"/>
+      </w:pPr>
+      <w:rPr>
+        <w:rFonts w:ascii="Courier New" w:hAnsi="Courier New" w:hint="default"/>
+        <w:sz w:val="20"/>
+      </w:rPr>
+    </w:lvl>
+    <w:lvl w:ilvl="2" w:tentative="1">
+      <w:start w:val="1"/>
+      <w:numFmt w:val="bullet"/>
+      <w:lvlText w:val=""/>
+      <w:lvlJc w:val="left"/>
+      <w:pPr>
+        <w:tabs>
+          <w:tab w:val="num" w:pos="2160"/>
+        </w:tabs>
+        <w:ind w:left="2160" w:hanging="360"/>
+      </w:pPr>
+      <w:rPr>
+        <w:rFonts w:ascii="Wingdings" w:hAnsi="Wingdings" w:hint="default"/>
+        <w:sz w:val="20"/>
+      </w:rPr>
+    </w:lvl>
+    <w:lvl w:ilvl="3" w:tentative="1">
+      <w:start w:val="1"/>
+      <w:numFmt w:val="bullet"/>
+      <w:lvlText w:val=""/>
+      <w:lvlJc w:val="left"/>
+      <w:pPr>
+        <w:tabs>
+          <w:tab w:val="num" w:pos="2880"/>
+        </w:tabs>
+        <w:ind w:left="2880" w:hanging="360"/>
+      </w:pPr>
+      <w:rPr>
+        <w:rFonts w:ascii="Wingdings" w:hAnsi="Wingdings" w:hint="default"/>
+        <w:sz w:val="20"/>
+      </w:rPr>
+    </w:lvl>
+    <w:lvl w:ilvl="4" w:tentative="1">
+      <w:start w:val="1"/>
+      <w:numFmt w:val="bullet"/>
+      <w:lvlText w:val=""/>
+      <w:lvlJc w:val="left"/>
+      <w:pPr>
+        <w:tabs>
+          <w:tab w:val="num" w:pos="3600"/>
+        </w:tabs>
+        <w:ind w:left="3600" w:hanging="360"/>
+      </w:pPr>
+      <w:rPr>
+        <w:rFonts w:ascii="Wingdings" w:hAnsi="Wingdings" w:hint="default"/>
+        <w:sz w:val="20"/>
+      </w:rPr>
+    </w:lvl>
+    <w:lvl w:ilvl="5" w:tentative="1">
+      <w:start w:val="1"/>
+      <w:numFmt w:val="bullet"/>
+      <w:lvlText w:val=""/>
+      <w:lvlJc w:val="left"/>
+      <w:pPr>
+        <w:tabs>
+          <w:tab w:val="num" w:pos="4320"/>
+        </w:tabs>
+        <w:ind w:left="4320" w:hanging="360"/>
+      </w:pPr>
+      <w:rPr>
+        <w:rFonts w:ascii="Wingdings" w:hAnsi="Wingdings" w:hint="default"/>
+        <w:sz w:val="20"/>
+      </w:rPr>
+    </w:lvl>
+    <w:lvl w:ilvl="6" w:tentative="1">
+      <w:start w:val="1"/>
+      <w:numFmt w:val="bullet"/>
+      <w:lvlText w:val=""/>
+      <w:lvlJc w:val="left"/>
+      <w:pPr>
+        <w:tabs>
+          <w:tab w:val="num" w:pos="5040"/>
+        </w:tabs>
+        <w:ind w:left="5040" w:hanging="360"/>
+      </w:pPr>
+      <w:rPr>
+        <w:rFonts w:ascii="Wingdings" w:hAnsi="Wingdings" w:hint="default"/>
+        <w:sz w:val="20"/>
+      </w:rPr>
+    </w:lvl>
+    <w:lvl w:ilvl="7" w:tentative="1">
+      <w:start w:val="1"/>
+      <w:numFmt w:val="bullet"/>
+      <w:lvlText w:val=""/>
+      <w:lvlJc w:val="left"/>
+      <w:pPr>
+        <w:tabs>
+          <w:tab w:val="num" w:pos="5760"/>
+        </w:tabs>
+        <w:ind w:left="5760" w:hanging="360"/>
+      </w:pPr>
+      <w:rPr>
+        <w:rFonts w:ascii="Wingdings" w:hAnsi="Wingdings" w:hint="default"/>
+        <w:sz w:val="20"/>
+      </w:rPr>
+    </w:lvl>
+    <w:lvl w:ilvl="8" w:tentative="1">
+      <w:start w:val="1"/>
+      <w:numFmt w:val="bullet"/>
+      <w:lvlText w:val=""/>
+      <w:lvlJc w:val="left"/>
+      <w:pPr>
+        <w:tabs>
+          <w:tab w:val="num" w:pos="6480"/>
+        </w:tabs>
+        <w:ind w:left="6480" w:hanging="360"/>
+      </w:pPr>
+      <w:rPr>
+        <w:rFonts w:ascii="Wingdings" w:hAnsi="Wingdings" w:hint="default"/>
+        <w:sz w:val="20"/>
+      </w:rPr>
+    </w:lvl>
+  </w:abstractNum>
+  <w:abstractNum w:abstractNumId="7" w15:restartNumberingAfterBreak="0">
+    <w:nsid w:val="666913D1"/>
+    <w:multiLevelType w:val="multilevel"/>
+    <w:tmpl w:val="CB02BA46"/>
+    <w:lvl w:ilvl="0">
+      <w:start w:val="1"/>
+      <w:numFmt w:val="bullet"/>
+      <w:lvlText w:val=""/>
+      <w:lvlJc w:val="left"/>
+      <w:pPr>
+        <w:tabs>
+          <w:tab w:val="num" w:pos="720"/>
+        </w:tabs>
+        <w:ind w:left="720" w:hanging="360"/>
+      </w:pPr>
+      <w:rPr>
+        <w:rFonts w:ascii="Symbol" w:hAnsi="Symbol" w:hint="default"/>
+        <w:sz w:val="20"/>
+      </w:rPr>
+    </w:lvl>
+    <w:lvl w:ilvl="1" w:tentative="1">
+      <w:start w:val="1"/>
+      <w:numFmt w:val="bullet"/>
+      <w:lvlText w:val="o"/>
+      <w:lvlJc w:val="left"/>
+      <w:pPr>
+        <w:tabs>
+          <w:tab w:val="num" w:pos="1440"/>
+        </w:tabs>
+        <w:ind w:left="1440" w:hanging="360"/>
+      </w:pPr>
+      <w:rPr>
+        <w:rFonts w:ascii="Courier New" w:hAnsi="Courier New" w:hint="default"/>
+        <w:sz w:val="20"/>
+      </w:rPr>
+    </w:lvl>
+    <w:lvl w:ilvl="2" w:tentative="1">
+      <w:start w:val="1"/>
+      <w:numFmt w:val="bullet"/>
+      <w:lvlText w:val=""/>
+      <w:lvlJc w:val="left"/>
+      <w:pPr>
+        <w:tabs>
+          <w:tab w:val="num" w:pos="2160"/>
+        </w:tabs>
+        <w:ind w:left="2160" w:hanging="360"/>
+      </w:pPr>
+      <w:rPr>
+        <w:rFonts w:ascii="Wingdings" w:hAnsi="Wingdings" w:hint="default"/>
+        <w:sz w:val="20"/>
+      </w:rPr>
+    </w:lvl>
+    <w:lvl w:ilvl="3" w:tentative="1">
+      <w:start w:val="1"/>
+      <w:numFmt w:val="bullet"/>
+      <w:lvlText w:val=""/>
+      <w:lvlJc w:val="left"/>
+      <w:pPr>
+        <w:tabs>
+          <w:tab w:val="num" w:pos="2880"/>
+        </w:tabs>
+        <w:ind w:left="2880" w:hanging="360"/>
+      </w:pPr>
+      <w:rPr>
+        <w:rFonts w:ascii="Wingdings" w:hAnsi="Wingdings" w:hint="default"/>
+        <w:sz w:val="20"/>
+      </w:rPr>
+    </w:lvl>
+    <w:lvl w:ilvl="4" w:tentative="1">
+      <w:start w:val="1"/>
+      <w:numFmt w:val="bullet"/>
+      <w:lvlText w:val=""/>
+      <w:lvlJc w:val="left"/>
+      <w:pPr>
+        <w:tabs>
+          <w:tab w:val="num" w:pos="3600"/>
+        </w:tabs>
+        <w:ind w:left="3600" w:hanging="360"/>
+      </w:pPr>
+      <w:rPr>
+        <w:rFonts w:ascii="Wingdings" w:hAnsi="Wingdings" w:hint="default"/>
+        <w:sz w:val="20"/>
+      </w:rPr>
+    </w:lvl>
+    <w:lvl w:ilvl="5" w:tentative="1">
+      <w:start w:val="1"/>
+      <w:numFmt w:val="bullet"/>
+      <w:lvlText w:val=""/>
+      <w:lvlJc w:val="left"/>
+      <w:pPr>
+        <w:tabs>
+          <w:tab w:val="num" w:pos="4320"/>
+        </w:tabs>
+        <w:ind w:left="4320" w:hanging="360"/>
+      </w:pPr>
+      <w:rPr>
+        <w:rFonts w:ascii="Wingdings" w:hAnsi="Wingdings" w:hint="default"/>
+        <w:sz w:val="20"/>
+      </w:rPr>
+    </w:lvl>
+    <w:lvl w:ilvl="6" w:tentative="1">
+      <w:start w:val="1"/>
+      <w:numFmt w:val="bullet"/>
+      <w:lvlText w:val=""/>
+      <w:lvlJc w:val="left"/>
+      <w:pPr>
+        <w:tabs>
+          <w:tab w:val="num" w:pos="5040"/>
+        </w:tabs>
+        <w:ind w:left="5040" w:hanging="360"/>
+      </w:pPr>
+      <w:rPr>
+        <w:rFonts w:ascii="Wingdings" w:hAnsi="Wingdings" w:hint="default"/>
+        <w:sz w:val="20"/>
+      </w:rPr>
+    </w:lvl>
+    <w:lvl w:ilvl="7" w:tentative="1">
+      <w:start w:val="1"/>
+      <w:numFmt w:val="bullet"/>
+      <w:lvlText w:val=""/>
+      <w:lvlJc w:val="left"/>
+      <w:pPr>
+        <w:tabs>
+          <w:tab w:val="num" w:pos="5760"/>
+        </w:tabs>
+        <w:ind w:left="5760" w:hanging="360"/>
+      </w:pPr>
+      <w:rPr>
+        <w:rFonts w:ascii="Wingdings" w:hAnsi="Wingdings" w:hint="default"/>
+        <w:sz w:val="20"/>
+      </w:rPr>
+    </w:lvl>
+    <w:lvl w:ilvl="8" w:tentative="1">
+      <w:start w:val="1"/>
+      <w:numFmt w:val="bullet"/>
+      <w:lvlText w:val=""/>
+      <w:lvlJc w:val="left"/>
+      <w:pPr>
+        <w:tabs>
+          <w:tab w:val="num" w:pos="6480"/>
+        </w:tabs>
+        <w:ind w:left="6480" w:hanging="360"/>
+      </w:pPr>
+      <w:rPr>
+        <w:rFonts w:ascii="Wingdings" w:hAnsi="Wingdings" w:hint="default"/>
+        <w:sz w:val="20"/>
+      </w:rPr>
+    </w:lvl>
+  </w:abstractNum>
+  <w:abstractNum w:abstractNumId="8" w15:restartNumberingAfterBreak="0">
+    <w:nsid w:val="68682604"/>
+    <w:multiLevelType w:val="multilevel"/>
+    <w:tmpl w:val="3A3C89B2"/>
+    <w:lvl w:ilvl="0">
+      <w:start w:val="1"/>
+      <w:numFmt w:val="bullet"/>
+      <w:lvlText w:val=""/>
+      <w:lvlJc w:val="left"/>
+      <w:pPr>
+        <w:tabs>
+          <w:tab w:val="num" w:pos="720"/>
+        </w:tabs>
+        <w:ind w:left="720" w:hanging="360"/>
+      </w:pPr>
+      <w:rPr>
+        <w:rFonts w:ascii="Symbol" w:hAnsi="Symbol" w:hint="default"/>
+        <w:sz w:val="20"/>
+      </w:rPr>
+    </w:lvl>
+    <w:lvl w:ilvl="1" w:tentative="1">
+      <w:start w:val="1"/>
+      <w:numFmt w:val="bullet"/>
+      <w:lvlText w:val="o"/>
+      <w:lvlJc w:val="left"/>
+      <w:pPr>
+        <w:tabs>
+          <w:tab w:val="num" w:pos="1440"/>
+        </w:tabs>
+        <w:ind w:left="1440" w:hanging="360"/>
+      </w:pPr>
+      <w:rPr>
+        <w:rFonts w:ascii="Courier New" w:hAnsi="Courier New" w:hint="default"/>
+        <w:sz w:val="20"/>
+      </w:rPr>
+    </w:lvl>
+    <w:lvl w:ilvl="2" w:tentative="1">
+      <w:start w:val="1"/>
+      <w:numFmt w:val="bullet"/>
+      <w:lvlText w:val=""/>
+      <w:lvlJc w:val="left"/>
+      <w:pPr>
+        <w:tabs>
+          <w:tab w:val="num" w:pos="2160"/>
+        </w:tabs>
+        <w:ind w:left="2160" w:hanging="360"/>
+      </w:pPr>
+      <w:rPr>
+        <w:rFonts w:ascii="Wingdings" w:hAnsi="Wingdings" w:hint="default"/>
+        <w:sz w:val="20"/>
+      </w:rPr>
+    </w:lvl>
+    <w:lvl w:ilvl="3" w:tentative="1">
+      <w:start w:val="1"/>
+      <w:numFmt w:val="bullet"/>
+      <w:lvlText w:val=""/>
+      <w:lvlJc w:val="left"/>
+      <w:pPr>
+        <w:tabs>
+          <w:tab w:val="num" w:pos="2880"/>
+        </w:tabs>
+        <w:ind w:left="2880" w:hanging="360"/>
+      </w:pPr>
+      <w:rPr>
+        <w:rFonts w:ascii="Wingdings" w:hAnsi="Wingdings" w:hint="default"/>
+        <w:sz w:val="20"/>
+      </w:rPr>
+    </w:lvl>
+    <w:lvl w:ilvl="4" w:tentative="1">
+      <w:start w:val="1"/>
+      <w:numFmt w:val="bullet"/>
+      <w:lvlText w:val=""/>
+      <w:lvlJc w:val="left"/>
+      <w:pPr>
+        <w:tabs>
+          <w:tab w:val="num" w:pos="3600"/>
+        </w:tabs>
+        <w:ind w:left="3600" w:hanging="360"/>
+      </w:pPr>
+      <w:rPr>
+        <w:rFonts w:ascii="Wingdings" w:hAnsi="Wingdings" w:hint="default"/>
+        <w:sz w:val="20"/>
+      </w:rPr>
+    </w:lvl>
+    <w:lvl w:ilvl="5" w:tentative="1">
+      <w:start w:val="1"/>
+      <w:numFmt w:val="bullet"/>
+      <w:lvlText w:val=""/>
+      <w:lvlJc w:val="left"/>
+      <w:pPr>
+        <w:tabs>
+          <w:tab w:val="num" w:pos="4320"/>
+        </w:tabs>
+        <w:ind w:left="4320" w:hanging="360"/>
+      </w:pPr>
+      <w:rPr>
+        <w:rFonts w:ascii="Wingdings" w:hAnsi="Wingdings" w:hint="default"/>
+        <w:sz w:val="20"/>
+      </w:rPr>
+    </w:lvl>
+    <w:lvl w:ilvl="6" w:tentative="1">
+      <w:start w:val="1"/>
+      <w:numFmt w:val="bullet"/>
+      <w:lvlText w:val=""/>
+      <w:lvlJc w:val="left"/>
+      <w:pPr>
+        <w:tabs>
+          <w:tab w:val="num" w:pos="5040"/>
+        </w:tabs>
+        <w:ind w:left="5040" w:hanging="360"/>
+      </w:pPr>
+      <w:rPr>
+        <w:rFonts w:ascii="Wingdings" w:hAnsi="Wingdings" w:hint="default"/>
+        <w:sz w:val="20"/>
+      </w:rPr>
+    </w:lvl>
+    <w:lvl w:ilvl="7" w:tentative="1">
+      <w:start w:val="1"/>
+      <w:numFmt w:val="bullet"/>
+      <w:lvlText w:val=""/>
+      <w:lvlJc w:val="left"/>
+      <w:pPr>
+        <w:tabs>
+          <w:tab w:val="num" w:pos="5760"/>
+        </w:tabs>
+        <w:ind w:left="5760" w:hanging="360"/>
+      </w:pPr>
+      <w:rPr>
+        <w:rFonts w:ascii="Wingdings" w:hAnsi="Wingdings" w:hint="default"/>
+        <w:sz w:val="20"/>
+      </w:rPr>
+    </w:lvl>
+    <w:lvl w:ilvl="8" w:tentative="1">
+      <w:start w:val="1"/>
+      <w:numFmt w:val="bullet"/>
+      <w:lvlText w:val=""/>
+      <w:lvlJc w:val="left"/>
+      <w:pPr>
+        <w:tabs>
+          <w:tab w:val="num" w:pos="6480"/>
+        </w:tabs>
+        <w:ind w:left="6480" w:hanging="360"/>
+      </w:pPr>
+      <w:rPr>
+        <w:rFonts w:ascii="Wingdings" w:hAnsi="Wingdings" w:hint="default"/>
+        <w:sz w:val="20"/>
+      </w:rPr>
+    </w:lvl>
+  </w:abstractNum>
+  <w:abstractNum w:abstractNumId="9" w15:restartNumberingAfterBreak="0">
+    <w:nsid w:val="6876447B"/>
+    <w:multiLevelType w:val="multilevel"/>
+    <w:tmpl w:val="CB448854"/>
+    <w:lvl w:ilvl="0">
+      <w:start w:val="1"/>
+      <w:numFmt w:val="bullet"/>
+      <w:lvlText w:val=""/>
+      <w:lvlJc w:val="left"/>
+      <w:pPr>
+        <w:tabs>
+          <w:tab w:val="num" w:pos="720"/>
+        </w:tabs>
+        <w:ind w:left="720" w:hanging="360"/>
+      </w:pPr>
+      <w:rPr>
+        <w:rFonts w:ascii="Symbol" w:hAnsi="Symbol" w:hint="default"/>
+        <w:sz w:val="20"/>
+      </w:rPr>
+    </w:lvl>
+    <w:lvl w:ilvl="1" w:tentative="1">
+      <w:start w:val="1"/>
+      <w:numFmt w:val="bullet"/>
+      <w:lvlText w:val="o"/>
+      <w:lvlJc w:val="left"/>
+      <w:pPr>
+        <w:tabs>
+          <w:tab w:val="num" w:pos="1440"/>
+        </w:tabs>
+        <w:ind w:left="1440" w:hanging="360"/>
+      </w:pPr>
+      <w:rPr>
+        <w:rFonts w:ascii="Courier New" w:hAnsi="Courier New" w:hint="default"/>
+        <w:sz w:val="20"/>
+      </w:rPr>
+    </w:lvl>
+    <w:lvl w:ilvl="2" w:tentative="1">
+      <w:start w:val="1"/>
+      <w:numFmt w:val="bullet"/>
+      <w:lvlText w:val=""/>
+      <w:lvlJc w:val="left"/>
+      <w:pPr>
+        <w:tabs>
+          <w:tab w:val="num" w:pos="2160"/>
+        </w:tabs>
+        <w:ind w:left="2160" w:hanging="360"/>
+      </w:pPr>
+      <w:rPr>
+        <w:rFonts w:ascii="Wingdings" w:hAnsi="Wingdings" w:hint="default"/>
+        <w:sz w:val="20"/>
+      </w:rPr>
+    </w:lvl>
+    <w:lvl w:ilvl="3" w:tentative="1">
+      <w:start w:val="1"/>
+      <w:numFmt w:val="bullet"/>
+      <w:lvlText w:val=""/>
+      <w:lvlJc w:val="left"/>
+      <w:pPr>
+        <w:tabs>
+          <w:tab w:val="num" w:pos="2880"/>
+        </w:tabs>
+        <w:ind w:left="2880" w:hanging="360"/>
+      </w:pPr>
+      <w:rPr>
+        <w:rFonts w:ascii="Wingdings" w:hAnsi="Wingdings" w:hint="default"/>
+        <w:sz w:val="20"/>
+      </w:rPr>
+    </w:lvl>
+    <w:lvl w:ilvl="4" w:tentative="1">
+      <w:start w:val="1"/>
+      <w:numFmt w:val="bullet"/>
+      <w:lvlText w:val=""/>
+      <w:lvlJc w:val="left"/>
+      <w:pPr>
+        <w:tabs>
+          <w:tab w:val="num" w:pos="3600"/>
+        </w:tabs>
+        <w:ind w:left="3600" w:hanging="360"/>
+      </w:pPr>
+      <w:rPr>
+        <w:rFonts w:ascii="Wingdings" w:hAnsi="Wingdings" w:hint="default"/>
+        <w:sz w:val="20"/>
+      </w:rPr>
+    </w:lvl>
+    <w:lvl w:ilvl="5" w:tentative="1">
+      <w:start w:val="1"/>
+      <w:numFmt w:val="bullet"/>
+      <w:lvlText w:val=""/>
+      <w:lvlJc w:val="left"/>
+      <w:pPr>
+        <w:tabs>
+          <w:tab w:val="num" w:pos="4320"/>
+        </w:tabs>
+        <w:ind w:left="4320" w:hanging="360"/>
+      </w:pPr>
+      <w:rPr>
+        <w:rFonts w:ascii="Wingdings" w:hAnsi="Wingdings" w:hint="default"/>
+        <w:sz w:val="20"/>
+      </w:rPr>
+    </w:lvl>
+    <w:lvl w:ilvl="6" w:tentative="1">
+      <w:start w:val="1"/>
+      <w:numFmt w:val="bullet"/>
+      <w:lvlText w:val=""/>
+      <w:lvlJc w:val="left"/>
+      <w:pPr>
+        <w:tabs>
+          <w:tab w:val="num" w:pos="5040"/>
+        </w:tabs>
+        <w:ind w:left="5040" w:hanging="360"/>
+      </w:pPr>
+      <w:rPr>
+        <w:rFonts w:ascii="Wingdings" w:hAnsi="Wingdings" w:hint="default"/>
+        <w:sz w:val="20"/>
+      </w:rPr>
+    </w:lvl>
+    <w:lvl w:ilvl="7" w:tentative="1">
+      <w:start w:val="1"/>
+      <w:numFmt w:val="bullet"/>
+      <w:lvlText w:val=""/>
+      <w:lvlJc w:val="left"/>
+      <w:pPr>
+        <w:tabs>
+          <w:tab w:val="num" w:pos="5760"/>
+        </w:tabs>
+        <w:ind w:left="5760" w:hanging="360"/>
+      </w:pPr>
+      <w:rPr>
+        <w:rFonts w:ascii="Wingdings" w:hAnsi="Wingdings" w:hint="default"/>
+        <w:sz w:val="20"/>
+      </w:rPr>
+    </w:lvl>
+    <w:lvl w:ilvl="8" w:tentative="1">
+      <w:start w:val="1"/>
+      <w:numFmt w:val="bullet"/>
+      <w:lvlText w:val=""/>
+      <w:lvlJc w:val="left"/>
+      <w:pPr>
+        <w:tabs>
+          <w:tab w:val="num" w:pos="6480"/>
+        </w:tabs>
+        <w:ind w:left="6480" w:hanging="360"/>
+      </w:pPr>
+      <w:rPr>
+        <w:rFonts w:ascii="Wingdings" w:hAnsi="Wingdings" w:hint="default"/>
+        <w:sz w:val="20"/>
+      </w:rPr>
+    </w:lvl>
+  </w:abstractNum>
+  <w:abstractNum w:abstractNumId="10" w15:restartNumberingAfterBreak="0">
+    <w:nsid w:val="6AC97B64"/>
+    <w:multiLevelType w:val="multilevel"/>
+    <w:tmpl w:val="0E542AB2"/>
+    <w:lvl w:ilvl="0">
+      <w:start w:val="1"/>
+      <w:numFmt w:val="bullet"/>
+      <w:lvlText w:val=""/>
+      <w:lvlJc w:val="left"/>
+      <w:pPr>
+        <w:tabs>
+          <w:tab w:val="num" w:pos="720"/>
+        </w:tabs>
+        <w:ind w:left="720" w:hanging="360"/>
+      </w:pPr>
+      <w:rPr>
+        <w:rFonts w:ascii="Symbol" w:hAnsi="Symbol" w:hint="default"/>
+        <w:sz w:val="20"/>
+      </w:rPr>
+    </w:lvl>
+    <w:lvl w:ilvl="1" w:tentative="1">
+      <w:start w:val="1"/>
+      <w:numFmt w:val="bullet"/>
+      <w:lvlText w:val="o"/>
+      <w:lvlJc w:val="left"/>
+      <w:pPr>
+        <w:tabs>
+          <w:tab w:val="num" w:pos="1440"/>
+        </w:tabs>
+        <w:ind w:left="1440" w:hanging="360"/>
+      </w:pPr>
+      <w:rPr>
+        <w:rFonts w:ascii="Courier New" w:hAnsi="Courier New" w:hint="default"/>
+        <w:sz w:val="20"/>
+      </w:rPr>
+    </w:lvl>
+    <w:lvl w:ilvl="2" w:tentative="1">
+      <w:start w:val="1"/>
+      <w:numFmt w:val="bullet"/>
+      <w:lvlText w:val=""/>
+      <w:lvlJc w:val="left"/>
+      <w:pPr>
+        <w:tabs>
+          <w:tab w:val="num" w:pos="2160"/>
+        </w:tabs>
+        <w:ind w:left="2160" w:hanging="360"/>
+      </w:pPr>
+      <w:rPr>
+        <w:rFonts w:ascii="Wingdings" w:hAnsi="Wingdings" w:hint="default"/>
+        <w:sz w:val="20"/>
+      </w:rPr>
+    </w:lvl>
+    <w:lvl w:ilvl="3" w:tentative="1">
+      <w:start w:val="1"/>
+      <w:numFmt w:val="bullet"/>
+      <w:lvlText w:val=""/>
+      <w:lvlJc w:val="left"/>
+      <w:pPr>
+        <w:tabs>
+          <w:tab w:val="num" w:pos="2880"/>
+        </w:tabs>
+        <w:ind w:left="2880" w:hanging="360"/>
+      </w:pPr>
+      <w:rPr>
+        <w:rFonts w:ascii="Wingdings" w:hAnsi="Wingdings" w:hint="default"/>
+        <w:sz w:val="20"/>
+      </w:rPr>
+    </w:lvl>
+    <w:lvl w:ilvl="4" w:tentative="1">
+      <w:start w:val="1"/>
+      <w:numFmt w:val="bullet"/>
+      <w:lvlText w:val=""/>
+      <w:lvlJc w:val="left"/>
+      <w:pPr>
+        <w:tabs>
+          <w:tab w:val="num" w:pos="3600"/>
+        </w:tabs>
+        <w:ind w:left="3600" w:hanging="360"/>
+      </w:pPr>
+      <w:rPr>
+        <w:rFonts w:ascii="Wingdings" w:hAnsi="Wingdings" w:hint="default"/>
+        <w:sz w:val="20"/>
+      </w:rPr>
+    </w:lvl>
+    <w:lvl w:ilvl="5" w:tentative="1">
+      <w:start w:val="1"/>
+      <w:numFmt w:val="bullet"/>
+      <w:lvlText w:val=""/>
+      <w:lvlJc w:val="left"/>
+      <w:pPr>
+        <w:tabs>
+          <w:tab w:val="num" w:pos="4320"/>
+        </w:tabs>
+        <w:ind w:left="4320" w:hanging="360"/>
+      </w:pPr>
+      <w:rPr>
+        <w:rFonts w:ascii="Wingdings" w:hAnsi="Wingdings" w:hint="default"/>
+        <w:sz w:val="20"/>
+      </w:rPr>
+    </w:lvl>
+    <w:lvl w:ilvl="6" w:tentative="1">
+      <w:start w:val="1"/>
+      <w:numFmt w:val="bullet"/>
+      <w:lvlText w:val=""/>
+      <w:lvlJc w:val="left"/>
+      <w:pPr>
+        <w:tabs>
+          <w:tab w:val="num" w:pos="5040"/>
+        </w:tabs>
+        <w:ind w:left="5040" w:hanging="360"/>
+      </w:pPr>
+      <w:rPr>
+        <w:rFonts w:ascii="Wingdings" w:hAnsi="Wingdings" w:hint="default"/>
+        <w:sz w:val="20"/>
+      </w:rPr>
+    </w:lvl>
+    <w:lvl w:ilvl="7" w:tentative="1">
+      <w:start w:val="1"/>
+      <w:numFmt w:val="bullet"/>
+      <w:lvlText w:val=""/>
+      <w:lvlJc w:val="left"/>
+      <w:pPr>
+        <w:tabs>
+          <w:tab w:val="num" w:pos="5760"/>
+        </w:tabs>
+        <w:ind w:left="5760" w:hanging="360"/>
+      </w:pPr>
+      <w:rPr>
+        <w:rFonts w:ascii="Wingdings" w:hAnsi="Wingdings" w:hint="default"/>
+        <w:sz w:val="20"/>
+      </w:rPr>
+    </w:lvl>
+    <w:lvl w:ilvl="8" w:tentative="1">
+      <w:start w:val="1"/>
+      <w:numFmt w:val="bullet"/>
+      <w:lvlText w:val=""/>
+      <w:lvlJc w:val="left"/>
+      <w:pPr>
+        <w:tabs>
+          <w:tab w:val="num" w:pos="6480"/>
+        </w:tabs>
+        <w:ind w:left="6480" w:hanging="360"/>
+      </w:pPr>
+      <w:rPr>
+        <w:rFonts w:ascii="Wingdings" w:hAnsi="Wingdings" w:hint="default"/>
+        <w:sz w:val="20"/>
+      </w:rPr>
+    </w:lvl>
+  </w:abstractNum>
+  <w:abstractNum w:abstractNumId="11" w15:restartNumberingAfterBreak="0">
+    <w:nsid w:val="6C0E13CF"/>
+    <w:multiLevelType w:val="multilevel"/>
+    <w:tmpl w:val="1C6CDEDE"/>
+    <w:lvl w:ilvl="0">
+      <w:start w:val="1"/>
+      <w:numFmt w:val="bullet"/>
+      <w:lvlText w:val=""/>
+      <w:lvlJc w:val="left"/>
+      <w:pPr>
+        <w:tabs>
+          <w:tab w:val="num" w:pos="720"/>
+        </w:tabs>
+        <w:ind w:left="720" w:hanging="360"/>
+      </w:pPr>
+      <w:rPr>
+        <w:rFonts w:ascii="Symbol" w:hAnsi="Symbol" w:hint="default"/>
+        <w:sz w:val="20"/>
+      </w:rPr>
+    </w:lvl>
+    <w:lvl w:ilvl="1" w:tentative="1">
+      <w:start w:val="1"/>
+      <w:numFmt w:val="bullet"/>
+      <w:lvlText w:val="o"/>
+      <w:lvlJc w:val="left"/>
+      <w:pPr>
+        <w:tabs>
+          <w:tab w:val="num" w:pos="1440"/>
+        </w:tabs>
+        <w:ind w:left="1440" w:hanging="360"/>
+      </w:pPr>
+      <w:rPr>
+        <w:rFonts w:ascii="Courier New" w:hAnsi="Courier New" w:hint="default"/>
+        <w:sz w:val="20"/>
+      </w:rPr>
+    </w:lvl>
+    <w:lvl w:ilvl="2" w:tentative="1">
+      <w:start w:val="1"/>
+      <w:numFmt w:val="bullet"/>
+      <w:lvlText w:val=""/>
+      <w:lvlJc w:val="left"/>
+      <w:pPr>
+        <w:tabs>
+          <w:tab w:val="num" w:pos="2160"/>
+        </w:tabs>
+        <w:ind w:left="2160" w:hanging="360"/>
+      </w:pPr>
+      <w:rPr>
+        <w:rFonts w:ascii="Wingdings" w:hAnsi="Wingdings" w:hint="default"/>
+        <w:sz w:val="20"/>
+      </w:rPr>
+    </w:lvl>
+    <w:lvl w:ilvl="3" w:tentative="1">
+      <w:start w:val="1"/>
+      <w:numFmt w:val="bullet"/>
+      <w:lvlText w:val=""/>
+      <w:lvlJc w:val="left"/>
+      <w:pPr>
+        <w:tabs>
+          <w:tab w:val="num" w:pos="2880"/>
+        </w:tabs>
+        <w:ind w:left="2880" w:hanging="360"/>
+      </w:pPr>
+      <w:rPr>
+        <w:rFonts w:ascii="Wingdings" w:hAnsi="Wingdings" w:hint="default"/>
+        <w:sz w:val="20"/>
+      </w:rPr>
+    </w:lvl>
+    <w:lvl w:ilvl="4" w:tentative="1">
+      <w:start w:val="1"/>
+      <w:numFmt w:val="bullet"/>
+      <w:lvlText w:val=""/>
+      <w:lvlJc w:val="left"/>
+      <w:pPr>
+        <w:tabs>
+          <w:tab w:val="num" w:pos="3600"/>
+        </w:tabs>
+        <w:ind w:left="3600" w:hanging="360"/>
+      </w:pPr>
+      <w:rPr>
+        <w:rFonts w:ascii="Wingdings" w:hAnsi="Wingdings" w:hint="default"/>
+        <w:sz w:val="20"/>
+      </w:rPr>
+    </w:lvl>
+    <w:lvl w:ilvl="5" w:tentative="1">
+      <w:start w:val="1"/>
+      <w:numFmt w:val="bullet"/>
+      <w:lvlText w:val=""/>
+      <w:lvlJc w:val="left"/>
+      <w:pPr>
+        <w:tabs>
+          <w:tab w:val="num" w:pos="4320"/>
+        </w:tabs>
+        <w:ind w:left="4320" w:hanging="360"/>
+      </w:pPr>
+      <w:rPr>
+        <w:rFonts w:ascii="Wingdings" w:hAnsi="Wingdings" w:hint="default"/>
+        <w:sz w:val="20"/>
+      </w:rPr>
+    </w:lvl>
+    <w:lvl w:ilvl="6" w:tentative="1">
+      <w:start w:val="1"/>
+      <w:numFmt w:val="bullet"/>
+      <w:lvlText w:val=""/>
+      <w:lvlJc w:val="left"/>
+      <w:pPr>
+        <w:tabs>
+          <w:tab w:val="num" w:pos="5040"/>
+        </w:tabs>
+        <w:ind w:left="5040" w:hanging="360"/>
+      </w:pPr>
+      <w:rPr>
+        <w:rFonts w:ascii="Wingdings" w:hAnsi="Wingdings" w:hint="default"/>
+        <w:sz w:val="20"/>
+      </w:rPr>
+    </w:lvl>
+    <w:lvl w:ilvl="7" w:tentative="1">
+      <w:start w:val="1"/>
+      <w:numFmt w:val="bullet"/>
+      <w:lvlText w:val=""/>
+      <w:lvlJc w:val="left"/>
+      <w:pPr>
+        <w:tabs>
+          <w:tab w:val="num" w:pos="5760"/>
+        </w:tabs>
+        <w:ind w:left="5760" w:hanging="360"/>
+      </w:pPr>
+      <w:rPr>
+        <w:rFonts w:ascii="Wingdings" w:hAnsi="Wingdings" w:hint="default"/>
+        <w:sz w:val="20"/>
+      </w:rPr>
+    </w:lvl>
+    <w:lvl w:ilvl="8" w:tentative="1">
+      <w:start w:val="1"/>
+      <w:numFmt w:val="bullet"/>
+      <w:lvlText w:val=""/>
+      <w:lvlJc w:val="left"/>
+      <w:pPr>
+        <w:tabs>
+          <w:tab w:val="num" w:pos="6480"/>
+        </w:tabs>
+        <w:ind w:left="6480" w:hanging="360"/>
+      </w:pPr>
+      <w:rPr>
+        <w:rFonts w:ascii="Wingdings" w:hAnsi="Wingdings" w:hint="default"/>
+        <w:sz w:val="20"/>
+      </w:rPr>
+    </w:lvl>
+  </w:abstractNum>
+  <w:abstractNum w:abstractNumId="12" w15:restartNumberingAfterBreak="0">
+    <w:nsid w:val="6E616125"/>
+    <w:multiLevelType w:val="multilevel"/>
+    <w:tmpl w:val="2B001E48"/>
+    <w:lvl w:ilvl="0">
+      <w:start w:val="1"/>
+      <w:numFmt w:val="bullet"/>
+      <w:lvlText w:val=""/>
+      <w:lvlJc w:val="left"/>
+      <w:pPr>
+        <w:tabs>
+          <w:tab w:val="num" w:pos="720"/>
+        </w:tabs>
+        <w:ind w:left="720" w:hanging="360"/>
+      </w:pPr>
+      <w:rPr>
+        <w:rFonts w:ascii="Symbol" w:hAnsi="Symbol" w:hint="default"/>
+        <w:sz w:val="20"/>
+      </w:rPr>
+    </w:lvl>
+    <w:lvl w:ilvl="1">
+      <w:start w:val="1"/>
+      <w:numFmt w:val="decimal"/>
+      <w:lvlText w:val="%2."/>
+      <w:lvlJc w:val="left"/>
+      <w:pPr>
+        <w:tabs>
+          <w:tab w:val="num" w:pos="1440"/>
+        </w:tabs>
+        <w:ind w:left="1440" w:hanging="360"/>
+      </w:pPr>
+    </w:lvl>
+    <w:lvl w:ilvl="2" w:tentative="1">
+      <w:start w:val="1"/>
+      <w:numFmt w:val="bullet"/>
+      <w:lvlText w:val=""/>
+      <w:lvlJc w:val="left"/>
+      <w:pPr>
+        <w:tabs>
+          <w:tab w:val="num" w:pos="2160"/>
+        </w:tabs>
+        <w:ind w:left="2160" w:hanging="360"/>
+      </w:pPr>
+      <w:rPr>
+        <w:rFonts w:ascii="Wingdings" w:hAnsi="Wingdings" w:hint="default"/>
+        <w:sz w:val="20"/>
+      </w:rPr>
+    </w:lvl>
+    <w:lvl w:ilvl="3" w:tentative="1">
+      <w:start w:val="1"/>
+      <w:numFmt w:val="bullet"/>
+      <w:lvlText w:val=""/>
+      <w:lvlJc w:val="left"/>
+      <w:pPr>
+        <w:tabs>
+          <w:tab w:val="num" w:pos="2880"/>
+        </w:tabs>
+        <w:ind w:left="2880" w:hanging="360"/>
+      </w:pPr>
+      <w:rPr>
+        <w:rFonts w:ascii="Wingdings" w:hAnsi="Wingdings" w:hint="default"/>
+        <w:sz w:val="20"/>
+      </w:rPr>
+    </w:lvl>
+    <w:lvl w:ilvl="4" w:tentative="1">
+      <w:start w:val="1"/>
+      <w:numFmt w:val="bullet"/>
+      <w:lvlText w:val=""/>
+      <w:lvlJc w:val="left"/>
+      <w:pPr>
+        <w:tabs>
+          <w:tab w:val="num" w:pos="3600"/>
+        </w:tabs>
+        <w:ind w:left="3600" w:hanging="360"/>
+      </w:pPr>
+      <w:rPr>
+        <w:rFonts w:ascii="Wingdings" w:hAnsi="Wingdings" w:hint="default"/>
+        <w:sz w:val="20"/>
+      </w:rPr>
+    </w:lvl>
+    <w:lvl w:ilvl="5" w:tentative="1">
+      <w:start w:val="1"/>
+      <w:numFmt w:val="bullet"/>
+      <w:lvlText w:val=""/>
+      <w:lvlJc w:val="left"/>
+      <w:pPr>
+        <w:tabs>
+          <w:tab w:val="num" w:pos="4320"/>
+        </w:tabs>
+        <w:ind w:left="4320" w:hanging="360"/>
+      </w:pPr>
+      <w:rPr>
+        <w:rFonts w:ascii="Wingdings" w:hAnsi="Wingdings" w:hint="default"/>
+        <w:sz w:val="20"/>
+      </w:rPr>
+    </w:lvl>
+    <w:lvl w:ilvl="6" w:tentative="1">
+      <w:start w:val="1"/>
+      <w:numFmt w:val="bullet"/>
+      <w:lvlText w:val=""/>
+      <w:lvlJc w:val="left"/>
+      <w:pPr>
+        <w:tabs>
+          <w:tab w:val="num" w:pos="5040"/>
+        </w:tabs>
+        <w:ind w:left="5040" w:hanging="360"/>
+      </w:pPr>
+      <w:rPr>
+        <w:rFonts w:ascii="Wingdings" w:hAnsi="Wingdings" w:hint="default"/>
+        <w:sz w:val="20"/>
+      </w:rPr>
+    </w:lvl>
+    <w:lvl w:ilvl="7" w:tentative="1">
+      <w:start w:val="1"/>
+      <w:numFmt w:val="bullet"/>
+      <w:lvlText w:val=""/>
+      <w:lvlJc w:val="left"/>
+      <w:pPr>
+        <w:tabs>
+          <w:tab w:val="num" w:pos="5760"/>
+        </w:tabs>
+        <w:ind w:left="5760" w:hanging="360"/>
+      </w:pPr>
+      <w:rPr>
+        <w:rFonts w:ascii="Wingdings" w:hAnsi="Wingdings" w:hint="default"/>
+        <w:sz w:val="20"/>
+      </w:rPr>
+    </w:lvl>
+    <w:lvl w:ilvl="8" w:tentative="1">
+      <w:start w:val="1"/>
+      <w:numFmt w:val="bullet"/>
+      <w:lvlText w:val=""/>
+      <w:lvlJc w:val="left"/>
+      <w:pPr>
+        <w:tabs>
+          <w:tab w:val="num" w:pos="6480"/>
+        </w:tabs>
+        <w:ind w:left="6480" w:hanging="360"/>
+      </w:pPr>
+      <w:rPr>
+        <w:rFonts w:ascii="Wingdings" w:hAnsi="Wingdings" w:hint="default"/>
+        <w:sz w:val="20"/>
+      </w:rPr>
+    </w:lvl>
+  </w:abstractNum>
+  <w:abstractNum w:abstractNumId="13" w15:restartNumberingAfterBreak="0">
+    <w:nsid w:val="729332E8"/>
+    <w:multiLevelType w:val="multilevel"/>
+    <w:tmpl w:val="62E4501E"/>
+    <w:lvl w:ilvl="0">
+      <w:start w:val="1"/>
+      <w:numFmt w:val="bullet"/>
+      <w:lvlText w:val=""/>
+      <w:lvlJc w:val="left"/>
+      <w:pPr>
+        <w:tabs>
+          <w:tab w:val="num" w:pos="720"/>
+        </w:tabs>
+        <w:ind w:left="720" w:hanging="360"/>
+      </w:pPr>
+      <w:rPr>
+        <w:rFonts w:ascii="Symbol" w:hAnsi="Symbol" w:hint="default"/>
+        <w:sz w:val="20"/>
+      </w:rPr>
+    </w:lvl>
+    <w:lvl w:ilvl="1">
+      <w:start w:val="1"/>
+      <w:numFmt w:val="bullet"/>
+      <w:lvlText w:val="o"/>
+      <w:lvlJc w:val="left"/>
+      <w:pPr>
+        <w:tabs>
+          <w:tab w:val="num" w:pos="1440"/>
+        </w:tabs>
+        <w:ind w:left="1440" w:hanging="360"/>
+      </w:pPr>
+      <w:rPr>
+        <w:rFonts w:ascii="Courier New" w:hAnsi="Courier New" w:hint="default"/>
+        <w:sz w:val="20"/>
+      </w:rPr>
+    </w:lvl>
+    <w:lvl w:ilvl="2" w:tentative="1">
+      <w:start w:val="1"/>
+      <w:numFmt w:val="bullet"/>
+      <w:lvlText w:val=""/>
+      <w:lvlJc w:val="left"/>
+      <w:pPr>
+        <w:tabs>
+          <w:tab w:val="num" w:pos="2160"/>
+        </w:tabs>
+        <w:ind w:left="2160" w:hanging="360"/>
+      </w:pPr>
+      <w:rPr>
+        <w:rFonts w:ascii="Wingdings" w:hAnsi="Wingdings" w:hint="default"/>
+        <w:sz w:val="20"/>
+      </w:rPr>
+    </w:lvl>
+    <w:lvl w:ilvl="3" w:tentative="1">
+      <w:start w:val="1"/>
+      <w:numFmt w:val="bullet"/>
+      <w:lvlText w:val=""/>
+      <w:lvlJc w:val="left"/>
+      <w:pPr>
+        <w:tabs>
+          <w:tab w:val="num" w:pos="2880"/>
+        </w:tabs>
+        <w:ind w:left="2880" w:hanging="360"/>
+      </w:pPr>
+      <w:rPr>
+        <w:rFonts w:ascii="Wingdings" w:hAnsi="Wingdings" w:hint="default"/>
+        <w:sz w:val="20"/>
+      </w:rPr>
+    </w:lvl>
+    <w:lvl w:ilvl="4" w:tentative="1">
+      <w:start w:val="1"/>
+      <w:numFmt w:val="bullet"/>
+      <w:lvlText w:val=""/>
+      <w:lvlJc w:val="left"/>
+      <w:pPr>
+        <w:tabs>
+          <w:tab w:val="num" w:pos="3600"/>
+        </w:tabs>
+        <w:ind w:left="3600" w:hanging="360"/>
+      </w:pPr>
+      <w:rPr>
+        <w:rFonts w:ascii="Wingdings" w:hAnsi="Wingdings" w:hint="default"/>
+        <w:sz w:val="20"/>
+      </w:rPr>
+    </w:lvl>
+    <w:lvl w:ilvl="5" w:tentative="1">
+      <w:start w:val="1"/>
+      <w:numFmt w:val="bullet"/>
+      <w:lvlText w:val=""/>
+      <w:lvlJc w:val="left"/>
+      <w:pPr>
+        <w:tabs>
+          <w:tab w:val="num" w:pos="4320"/>
+        </w:tabs>
+        <w:ind w:left="4320" w:hanging="360"/>
+      </w:pPr>
+      <w:rPr>
+        <w:rFonts w:ascii="Wingdings" w:hAnsi="Wingdings" w:hint="default"/>
+        <w:sz w:val="20"/>
+      </w:rPr>
+    </w:lvl>
+    <w:lvl w:ilvl="6" w:tentative="1">
+      <w:start w:val="1"/>
+      <w:numFmt w:val="bullet"/>
+      <w:lvlText w:val=""/>
+      <w:lvlJc w:val="left"/>
+      <w:pPr>
+        <w:tabs>
+          <w:tab w:val="num" w:pos="5040"/>
+        </w:tabs>
+        <w:ind w:left="5040" w:hanging="360"/>
+      </w:pPr>
+      <w:rPr>
+        <w:rFonts w:ascii="Wingdings" w:hAnsi="Wingdings" w:hint="default"/>
+        <w:sz w:val="20"/>
+      </w:rPr>
+    </w:lvl>
+    <w:lvl w:ilvl="7" w:tentative="1">
+      <w:start w:val="1"/>
+      <w:numFmt w:val="bullet"/>
+      <w:lvlText w:val=""/>
+      <w:lvlJc w:val="left"/>
+      <w:pPr>
+        <w:tabs>
+          <w:tab w:val="num" w:pos="5760"/>
+        </w:tabs>
+        <w:ind w:left="5760" w:hanging="360"/>
+      </w:pPr>
+      <w:rPr>
+        <w:rFonts w:ascii="Wingdings" w:hAnsi="Wingdings" w:hint="default"/>
+        <w:sz w:val="20"/>
+      </w:rPr>
+    </w:lvl>
+    <w:lvl w:ilvl="8" w:tentative="1">
+      <w:start w:val="1"/>
+      <w:numFmt w:val="bullet"/>
+      <w:lvlText w:val=""/>
+      <w:lvlJc w:val="left"/>
+      <w:pPr>
+        <w:tabs>
+          <w:tab w:val="num" w:pos="6480"/>
+        </w:tabs>
+        <w:ind w:left="6480" w:hanging="360"/>
+      </w:pPr>
+      <w:rPr>
+        <w:rFonts w:ascii="Wingdings" w:hAnsi="Wingdings" w:hint="default"/>
+        <w:sz w:val="20"/>
+      </w:rPr>
+    </w:lvl>
+  </w:abstractNum>
+  <w:abstractNum w:abstractNumId="14" w15:restartNumberingAfterBreak="0">
+    <w:nsid w:val="783D049A"/>
+    <w:multiLevelType w:val="multilevel"/>
+    <w:tmpl w:val="5AD65FC4"/>
+    <w:lvl w:ilvl="0">
+      <w:start w:val="1"/>
+      <w:numFmt w:val="bullet"/>
+      <w:lvlText w:val=""/>
+      <w:lvlJc w:val="left"/>
+      <w:pPr>
+        <w:tabs>
+          <w:tab w:val="num" w:pos="720"/>
+        </w:tabs>
+        <w:ind w:left="720" w:hanging="360"/>
+      </w:pPr>
+      <w:rPr>
+        <w:rFonts w:ascii="Symbol" w:hAnsi="Symbol" w:hint="default"/>
+        <w:sz w:val="20"/>
+      </w:rPr>
+    </w:lvl>
+    <w:lvl w:ilvl="1" w:tentative="1">
+      <w:start w:val="1"/>
+      <w:numFmt w:val="bullet"/>
+      <w:lvlText w:val="o"/>
+      <w:lvlJc w:val="left"/>
+      <w:pPr>
+        <w:tabs>
+          <w:tab w:val="num" w:pos="1440"/>
+        </w:tabs>
+        <w:ind w:left="1440" w:hanging="360"/>
+      </w:pPr>
+      <w:rPr>
+        <w:rFonts w:ascii="Courier New" w:hAnsi="Courier New" w:hint="default"/>
+        <w:sz w:val="20"/>
+      </w:rPr>
+    </w:lvl>
+    <w:lvl w:ilvl="2" w:tentative="1">
+      <w:start w:val="1"/>
+      <w:numFmt w:val="bullet"/>
+      <w:lvlText w:val=""/>
+      <w:lvlJc w:val="left"/>
+      <w:pPr>
+        <w:tabs>
+          <w:tab w:val="num" w:pos="2160"/>
+        </w:tabs>
+        <w:ind w:left="2160" w:hanging="360"/>
+      </w:pPr>
+      <w:rPr>
+        <w:rFonts w:ascii="Wingdings" w:hAnsi="Wingdings" w:hint="default"/>
+        <w:sz w:val="20"/>
+      </w:rPr>
+    </w:lvl>
+    <w:lvl w:ilvl="3" w:tentative="1">
+      <w:start w:val="1"/>
+      <w:numFmt w:val="bullet"/>
+      <w:lvlText w:val=""/>
+      <w:lvlJc w:val="left"/>
+      <w:pPr>
+        <w:tabs>
+          <w:tab w:val="num" w:pos="2880"/>
+        </w:tabs>
+        <w:ind w:left="2880" w:hanging="360"/>
+      </w:pPr>
+      <w:rPr>
+        <w:rFonts w:ascii="Wingdings" w:hAnsi="Wingdings" w:hint="default"/>
+        <w:sz w:val="20"/>
+      </w:rPr>
+    </w:lvl>
+    <w:lvl w:ilvl="4" w:tentative="1">
+      <w:start w:val="1"/>
+      <w:numFmt w:val="bullet"/>
+      <w:lvlText w:val=""/>
+      <w:lvlJc w:val="left"/>
+      <w:pPr>
+        <w:tabs>
+          <w:tab w:val="num" w:pos="3600"/>
+        </w:tabs>
+        <w:ind w:left="3600" w:hanging="360"/>
+      </w:pPr>
+      <w:rPr>
+        <w:rFonts w:ascii="Wingdings" w:hAnsi="Wingdings" w:hint="default"/>
+        <w:sz w:val="20"/>
+      </w:rPr>
+    </w:lvl>
+    <w:lvl w:ilvl="5" w:tentative="1">
+      <w:start w:val="1"/>
+      <w:numFmt w:val="bullet"/>
+      <w:lvlText w:val=""/>
+      <w:lvlJc w:val="left"/>
+      <w:pPr>
+        <w:tabs>
+          <w:tab w:val="num" w:pos="4320"/>
+        </w:tabs>
+        <w:ind w:left="4320" w:hanging="360"/>
+      </w:pPr>
+      <w:rPr>
+        <w:rFonts w:ascii="Wingdings" w:hAnsi="Wingdings" w:hint="default"/>
+        <w:sz w:val="20"/>
+      </w:rPr>
+    </w:lvl>
+    <w:lvl w:ilvl="6" w:tentative="1">
+      <w:start w:val="1"/>
+      <w:numFmt w:val="bullet"/>
+      <w:lvlText w:val=""/>
+      <w:lvlJc w:val="left"/>
+      <w:pPr>
+        <w:tabs>
+          <w:tab w:val="num" w:pos="5040"/>
+        </w:tabs>
+        <w:ind w:left="5040" w:hanging="360"/>
+      </w:pPr>
+      <w:rPr>
+        <w:rFonts w:ascii="Wingdings" w:hAnsi="Wingdings" w:hint="default"/>
+        <w:sz w:val="20"/>
+      </w:rPr>
+    </w:lvl>
+    <w:lvl w:ilvl="7" w:tentative="1">
+      <w:start w:val="1"/>
+      <w:numFmt w:val="bullet"/>
+      <w:lvlText w:val=""/>
+      <w:lvlJc w:val="left"/>
+      <w:pPr>
+        <w:tabs>
+          <w:tab w:val="num" w:pos="5760"/>
+        </w:tabs>
+        <w:ind w:left="5760" w:hanging="360"/>
+      </w:pPr>
+      <w:rPr>
+        <w:rFonts w:ascii="Wingdings" w:hAnsi="Wingdings" w:hint="default"/>
+        <w:sz w:val="20"/>
+      </w:rPr>
+    </w:lvl>
+    <w:lvl w:ilvl="8" w:tentative="1">
+      <w:start w:val="1"/>
+      <w:numFmt w:val="bullet"/>
+      <w:lvlText w:val=""/>
+      <w:lvlJc w:val="left"/>
+      <w:pPr>
+        <w:tabs>
+          <w:tab w:val="num" w:pos="6480"/>
+        </w:tabs>
+        <w:ind w:left="6480" w:hanging="360"/>
+      </w:pPr>
+      <w:rPr>
+        <w:rFonts w:ascii="Wingdings" w:hAnsi="Wingdings" w:hint="default"/>
+        <w:sz w:val="20"/>
+      </w:rPr>
+    </w:lvl>
+  </w:abstractNum>
+  <w:abstractNum w:abstractNumId="15" w15:restartNumberingAfterBreak="0">
     <w:nsid w:val="7B7A52A4"/>
     <w:multiLevelType w:val="multilevel"/>
     <w:tmpl w:val="4088F676"/>
@@ -1879,7 +6504,52 @@
     </w:lvl>
   </w:abstractNum>
   <w:num w:numId="1" w16cid:durableId="1682779227">
+    <w:abstractNumId w:val="15"/>
+  </w:num>
+  <w:num w:numId="2" w16cid:durableId="921137907">
+    <w:abstractNumId w:val="14"/>
+  </w:num>
+  <w:num w:numId="3" w16cid:durableId="1223444268">
+    <w:abstractNumId w:val="1"/>
+  </w:num>
+  <w:num w:numId="4" w16cid:durableId="1912302454">
+    <w:abstractNumId w:val="3"/>
+  </w:num>
+  <w:num w:numId="5" w16cid:durableId="510535159">
+    <w:abstractNumId w:val="5"/>
+  </w:num>
+  <w:num w:numId="6" w16cid:durableId="1558786016">
+    <w:abstractNumId w:val="4"/>
+  </w:num>
+  <w:num w:numId="7" w16cid:durableId="1540363264">
+    <w:abstractNumId w:val="7"/>
+  </w:num>
+  <w:num w:numId="8" w16cid:durableId="1377894465">
+    <w:abstractNumId w:val="9"/>
+  </w:num>
+  <w:num w:numId="9" w16cid:durableId="229388444">
+    <w:abstractNumId w:val="8"/>
+  </w:num>
+  <w:num w:numId="10" w16cid:durableId="1011637563">
+    <w:abstractNumId w:val="11"/>
+  </w:num>
+  <w:num w:numId="11" w16cid:durableId="116803279">
+    <w:abstractNumId w:val="13"/>
+  </w:num>
+  <w:num w:numId="12" w16cid:durableId="861436953">
+    <w:abstractNumId w:val="10"/>
+  </w:num>
+  <w:num w:numId="13" w16cid:durableId="620919775">
+    <w:abstractNumId w:val="2"/>
+  </w:num>
+  <w:num w:numId="14" w16cid:durableId="443422040">
+    <w:abstractNumId w:val="12"/>
+  </w:num>
+  <w:num w:numId="15" w16cid:durableId="1453354493">
     <w:abstractNumId w:val="0"/>
+  </w:num>
+  <w:num w:numId="16" w16cid:durableId="881284260">
+    <w:abstractNumId w:val="6"/>
   </w:num>
 </w:numbering>
 </file>

</xml_diff>